<commit_message>
se corrigio un error al crear un servicio
</commit_message>
<xml_diff>
--- a/Fase 4 - Componente práctico.docx
+++ b/Fase 4 - Componente práctico.docx
@@ -91,12 +91,42 @@
         </w:rPr>
         <w:fldChar w:fldCharType="end"/>
       </w:r>
+      <w:proofErr w:type="spellStart"/>
       <w:r>
         <w:rPr>
           <w:b/>
         </w:rPr>
-        <w:t>Fase 4 - Componente práctico</w:t>
-      </w:r>
+        <w:t>Fase</w:t>
+      </w:r>
+      <w:proofErr w:type="spellEnd"/>
+      <w:r>
+        <w:rPr>
+          <w:b/>
+        </w:rPr>
+        <w:t xml:space="preserve"> 4 - </w:t>
+      </w:r>
+      <w:proofErr w:type="spellStart"/>
+      <w:r>
+        <w:rPr>
+          <w:b/>
+        </w:rPr>
+        <w:t>Componente</w:t>
+      </w:r>
+      <w:proofErr w:type="spellEnd"/>
+      <w:r>
+        <w:rPr>
+          <w:b/>
+        </w:rPr>
+        <w:t xml:space="preserve"> </w:t>
+      </w:r>
+      <w:proofErr w:type="spellStart"/>
+      <w:r>
+        <w:rPr>
+          <w:b/>
+        </w:rPr>
+        <w:t>práctico</w:t>
+      </w:r>
+      <w:proofErr w:type="spellEnd"/>
     </w:p>
     <w:p>
       <w:pPr>
@@ -760,7 +790,7 @@
           <w:szCs w:val="24"/>
           <w:lang w:val="es-ES" w:eastAsia="es-CO"/>
         </w:rPr>
-        <w:t>7</w:t>
+        <w:t>9</w:t>
       </w:r>
       <w:r>
         <w:rPr>
@@ -835,14 +865,745 @@
           <w:lang w:eastAsia="es-CO"/>
         </w:rPr>
       </w:pPr>
-      <w:r>
-        <w:rPr>
-          <w:rFonts w:cstheme="minorHAnsi"/>
-          <w:sz w:val="24"/>
-          <w:szCs w:val="24"/>
-          <w:lang w:eastAsia="es-CO"/>
-        </w:rPr>
-        <w:t>En el desarrollo de esta actividad se implementa un sistema orientado a objetos en Python, enfocado en la gestión de clientes, servicios y reservas para una empresa ficticia denominada Software FJ. El propósito principal es aplicar conceptos fundamentales de la Programación Orientada a Objetos (POO), tales como abstracción, encapsulación, herencia y polimorfismo, junto con el manejo avanzado de excepciones.</w:t>
+      <w:proofErr w:type="spellStart"/>
+      <w:r>
+        <w:rPr>
+          <w:rFonts w:cstheme="minorHAnsi"/>
+          <w:sz w:val="24"/>
+          <w:szCs w:val="24"/>
+          <w:lang w:eastAsia="es-CO"/>
+        </w:rPr>
+        <w:t>En</w:t>
+      </w:r>
+      <w:proofErr w:type="spellEnd"/>
+      <w:r>
+        <w:rPr>
+          <w:rFonts w:cstheme="minorHAnsi"/>
+          <w:sz w:val="24"/>
+          <w:szCs w:val="24"/>
+          <w:lang w:eastAsia="es-CO"/>
+        </w:rPr>
+        <w:t xml:space="preserve"> </w:t>
+      </w:r>
+      <w:proofErr w:type="spellStart"/>
+      <w:r>
+        <w:rPr>
+          <w:rFonts w:cstheme="minorHAnsi"/>
+          <w:sz w:val="24"/>
+          <w:szCs w:val="24"/>
+          <w:lang w:eastAsia="es-CO"/>
+        </w:rPr>
+        <w:t>el</w:t>
+      </w:r>
+      <w:proofErr w:type="spellEnd"/>
+      <w:r>
+        <w:rPr>
+          <w:rFonts w:cstheme="minorHAnsi"/>
+          <w:sz w:val="24"/>
+          <w:szCs w:val="24"/>
+          <w:lang w:eastAsia="es-CO"/>
+        </w:rPr>
+        <w:t xml:space="preserve"> </w:t>
+      </w:r>
+      <w:proofErr w:type="spellStart"/>
+      <w:r>
+        <w:rPr>
+          <w:rFonts w:cstheme="minorHAnsi"/>
+          <w:sz w:val="24"/>
+          <w:szCs w:val="24"/>
+          <w:lang w:eastAsia="es-CO"/>
+        </w:rPr>
+        <w:t>desarrollo</w:t>
+      </w:r>
+      <w:proofErr w:type="spellEnd"/>
+      <w:r>
+        <w:rPr>
+          <w:rFonts w:cstheme="minorHAnsi"/>
+          <w:sz w:val="24"/>
+          <w:szCs w:val="24"/>
+          <w:lang w:eastAsia="es-CO"/>
+        </w:rPr>
+        <w:t xml:space="preserve"> de </w:t>
+      </w:r>
+      <w:proofErr w:type="spellStart"/>
+      <w:r>
+        <w:rPr>
+          <w:rFonts w:cstheme="minorHAnsi"/>
+          <w:sz w:val="24"/>
+          <w:szCs w:val="24"/>
+          <w:lang w:eastAsia="es-CO"/>
+        </w:rPr>
+        <w:t>esta</w:t>
+      </w:r>
+      <w:proofErr w:type="spellEnd"/>
+      <w:r>
+        <w:rPr>
+          <w:rFonts w:cstheme="minorHAnsi"/>
+          <w:sz w:val="24"/>
+          <w:szCs w:val="24"/>
+          <w:lang w:eastAsia="es-CO"/>
+        </w:rPr>
+        <w:t xml:space="preserve"> </w:t>
+      </w:r>
+      <w:proofErr w:type="spellStart"/>
+      <w:r>
+        <w:rPr>
+          <w:rFonts w:cstheme="minorHAnsi"/>
+          <w:sz w:val="24"/>
+          <w:szCs w:val="24"/>
+          <w:lang w:eastAsia="es-CO"/>
+        </w:rPr>
+        <w:t>actividad</w:t>
+      </w:r>
+      <w:proofErr w:type="spellEnd"/>
+      <w:r>
+        <w:rPr>
+          <w:rFonts w:cstheme="minorHAnsi"/>
+          <w:sz w:val="24"/>
+          <w:szCs w:val="24"/>
+          <w:lang w:eastAsia="es-CO"/>
+        </w:rPr>
+        <w:t xml:space="preserve"> se </w:t>
+      </w:r>
+      <w:proofErr w:type="spellStart"/>
+      <w:r>
+        <w:rPr>
+          <w:rFonts w:cstheme="minorHAnsi"/>
+          <w:sz w:val="24"/>
+          <w:szCs w:val="24"/>
+          <w:lang w:eastAsia="es-CO"/>
+        </w:rPr>
+        <w:t>implementa</w:t>
+      </w:r>
+      <w:proofErr w:type="spellEnd"/>
+      <w:r>
+        <w:rPr>
+          <w:rFonts w:cstheme="minorHAnsi"/>
+          <w:sz w:val="24"/>
+          <w:szCs w:val="24"/>
+          <w:lang w:eastAsia="es-CO"/>
+        </w:rPr>
+        <w:t xml:space="preserve"> un </w:t>
+      </w:r>
+      <w:proofErr w:type="spellStart"/>
+      <w:r>
+        <w:rPr>
+          <w:rFonts w:cstheme="minorHAnsi"/>
+          <w:sz w:val="24"/>
+          <w:szCs w:val="24"/>
+          <w:lang w:eastAsia="es-CO"/>
+        </w:rPr>
+        <w:t>sistema</w:t>
+      </w:r>
+      <w:proofErr w:type="spellEnd"/>
+      <w:r>
+        <w:rPr>
+          <w:rFonts w:cstheme="minorHAnsi"/>
+          <w:sz w:val="24"/>
+          <w:szCs w:val="24"/>
+          <w:lang w:eastAsia="es-CO"/>
+        </w:rPr>
+        <w:t xml:space="preserve"> </w:t>
+      </w:r>
+      <w:proofErr w:type="spellStart"/>
+      <w:r>
+        <w:rPr>
+          <w:rFonts w:cstheme="minorHAnsi"/>
+          <w:sz w:val="24"/>
+          <w:szCs w:val="24"/>
+          <w:lang w:eastAsia="es-CO"/>
+        </w:rPr>
+        <w:t>orientado</w:t>
+      </w:r>
+      <w:proofErr w:type="spellEnd"/>
+      <w:r>
+        <w:rPr>
+          <w:rFonts w:cstheme="minorHAnsi"/>
+          <w:sz w:val="24"/>
+          <w:szCs w:val="24"/>
+          <w:lang w:eastAsia="es-CO"/>
+        </w:rPr>
+        <w:t xml:space="preserve"> </w:t>
+      </w:r>
+      <w:proofErr w:type="gramStart"/>
+      <w:r>
+        <w:rPr>
+          <w:rFonts w:cstheme="minorHAnsi"/>
+          <w:sz w:val="24"/>
+          <w:szCs w:val="24"/>
+          <w:lang w:eastAsia="es-CO"/>
+        </w:rPr>
+        <w:t>a</w:t>
+      </w:r>
+      <w:proofErr w:type="gramEnd"/>
+      <w:r>
+        <w:rPr>
+          <w:rFonts w:cstheme="minorHAnsi"/>
+          <w:sz w:val="24"/>
+          <w:szCs w:val="24"/>
+          <w:lang w:eastAsia="es-CO"/>
+        </w:rPr>
+        <w:t xml:space="preserve"> </w:t>
+      </w:r>
+      <w:proofErr w:type="spellStart"/>
+      <w:r>
+        <w:rPr>
+          <w:rFonts w:cstheme="minorHAnsi"/>
+          <w:sz w:val="24"/>
+          <w:szCs w:val="24"/>
+          <w:lang w:eastAsia="es-CO"/>
+        </w:rPr>
+        <w:t>objetos</w:t>
+      </w:r>
+      <w:proofErr w:type="spellEnd"/>
+      <w:r>
+        <w:rPr>
+          <w:rFonts w:cstheme="minorHAnsi"/>
+          <w:sz w:val="24"/>
+          <w:szCs w:val="24"/>
+          <w:lang w:eastAsia="es-CO"/>
+        </w:rPr>
+        <w:t xml:space="preserve"> </w:t>
+      </w:r>
+      <w:proofErr w:type="spellStart"/>
+      <w:r>
+        <w:rPr>
+          <w:rFonts w:cstheme="minorHAnsi"/>
+          <w:sz w:val="24"/>
+          <w:szCs w:val="24"/>
+          <w:lang w:eastAsia="es-CO"/>
+        </w:rPr>
+        <w:t>en</w:t>
+      </w:r>
+      <w:proofErr w:type="spellEnd"/>
+      <w:r>
+        <w:rPr>
+          <w:rFonts w:cstheme="minorHAnsi"/>
+          <w:sz w:val="24"/>
+          <w:szCs w:val="24"/>
+          <w:lang w:eastAsia="es-CO"/>
+        </w:rPr>
+        <w:t xml:space="preserve"> Python, </w:t>
+      </w:r>
+      <w:proofErr w:type="spellStart"/>
+      <w:r>
+        <w:rPr>
+          <w:rFonts w:cstheme="minorHAnsi"/>
+          <w:sz w:val="24"/>
+          <w:szCs w:val="24"/>
+          <w:lang w:eastAsia="es-CO"/>
+        </w:rPr>
+        <w:t>enfocado</w:t>
+      </w:r>
+      <w:proofErr w:type="spellEnd"/>
+      <w:r>
+        <w:rPr>
+          <w:rFonts w:cstheme="minorHAnsi"/>
+          <w:sz w:val="24"/>
+          <w:szCs w:val="24"/>
+          <w:lang w:eastAsia="es-CO"/>
+        </w:rPr>
+        <w:t xml:space="preserve"> </w:t>
+      </w:r>
+      <w:proofErr w:type="spellStart"/>
+      <w:r>
+        <w:rPr>
+          <w:rFonts w:cstheme="minorHAnsi"/>
+          <w:sz w:val="24"/>
+          <w:szCs w:val="24"/>
+          <w:lang w:eastAsia="es-CO"/>
+        </w:rPr>
+        <w:t>en</w:t>
+      </w:r>
+      <w:proofErr w:type="spellEnd"/>
+      <w:r>
+        <w:rPr>
+          <w:rFonts w:cstheme="minorHAnsi"/>
+          <w:sz w:val="24"/>
+          <w:szCs w:val="24"/>
+          <w:lang w:eastAsia="es-CO"/>
+        </w:rPr>
+        <w:t xml:space="preserve"> la </w:t>
+      </w:r>
+      <w:proofErr w:type="spellStart"/>
+      <w:r>
+        <w:rPr>
+          <w:rFonts w:cstheme="minorHAnsi"/>
+          <w:sz w:val="24"/>
+          <w:szCs w:val="24"/>
+          <w:lang w:eastAsia="es-CO"/>
+        </w:rPr>
+        <w:t>gestión</w:t>
+      </w:r>
+      <w:proofErr w:type="spellEnd"/>
+      <w:r>
+        <w:rPr>
+          <w:rFonts w:cstheme="minorHAnsi"/>
+          <w:sz w:val="24"/>
+          <w:szCs w:val="24"/>
+          <w:lang w:eastAsia="es-CO"/>
+        </w:rPr>
+        <w:t xml:space="preserve"> de </w:t>
+      </w:r>
+      <w:proofErr w:type="spellStart"/>
+      <w:r>
+        <w:rPr>
+          <w:rFonts w:cstheme="minorHAnsi"/>
+          <w:sz w:val="24"/>
+          <w:szCs w:val="24"/>
+          <w:lang w:eastAsia="es-CO"/>
+        </w:rPr>
+        <w:t>clientes</w:t>
+      </w:r>
+      <w:proofErr w:type="spellEnd"/>
+      <w:r>
+        <w:rPr>
+          <w:rFonts w:cstheme="minorHAnsi"/>
+          <w:sz w:val="24"/>
+          <w:szCs w:val="24"/>
+          <w:lang w:eastAsia="es-CO"/>
+        </w:rPr>
+        <w:t xml:space="preserve">, </w:t>
+      </w:r>
+      <w:proofErr w:type="spellStart"/>
+      <w:r>
+        <w:rPr>
+          <w:rFonts w:cstheme="minorHAnsi"/>
+          <w:sz w:val="24"/>
+          <w:szCs w:val="24"/>
+          <w:lang w:eastAsia="es-CO"/>
+        </w:rPr>
+        <w:t>servicios</w:t>
+      </w:r>
+      <w:proofErr w:type="spellEnd"/>
+      <w:r>
+        <w:rPr>
+          <w:rFonts w:cstheme="minorHAnsi"/>
+          <w:sz w:val="24"/>
+          <w:szCs w:val="24"/>
+          <w:lang w:eastAsia="es-CO"/>
+        </w:rPr>
+        <w:t xml:space="preserve"> y </w:t>
+      </w:r>
+      <w:proofErr w:type="spellStart"/>
+      <w:r>
+        <w:rPr>
+          <w:rFonts w:cstheme="minorHAnsi"/>
+          <w:sz w:val="24"/>
+          <w:szCs w:val="24"/>
+          <w:lang w:eastAsia="es-CO"/>
+        </w:rPr>
+        <w:t>reservas</w:t>
+      </w:r>
+      <w:proofErr w:type="spellEnd"/>
+      <w:r>
+        <w:rPr>
+          <w:rFonts w:cstheme="minorHAnsi"/>
+          <w:sz w:val="24"/>
+          <w:szCs w:val="24"/>
+          <w:lang w:eastAsia="es-CO"/>
+        </w:rPr>
+        <w:t xml:space="preserve"> para </w:t>
+      </w:r>
+      <w:proofErr w:type="spellStart"/>
+      <w:r>
+        <w:rPr>
+          <w:rFonts w:cstheme="minorHAnsi"/>
+          <w:sz w:val="24"/>
+          <w:szCs w:val="24"/>
+          <w:lang w:eastAsia="es-CO"/>
+        </w:rPr>
+        <w:t>una</w:t>
+      </w:r>
+      <w:proofErr w:type="spellEnd"/>
+      <w:r>
+        <w:rPr>
+          <w:rFonts w:cstheme="minorHAnsi"/>
+          <w:sz w:val="24"/>
+          <w:szCs w:val="24"/>
+          <w:lang w:eastAsia="es-CO"/>
+        </w:rPr>
+        <w:t xml:space="preserve"> </w:t>
+      </w:r>
+      <w:proofErr w:type="spellStart"/>
+      <w:r>
+        <w:rPr>
+          <w:rFonts w:cstheme="minorHAnsi"/>
+          <w:sz w:val="24"/>
+          <w:szCs w:val="24"/>
+          <w:lang w:eastAsia="es-CO"/>
+        </w:rPr>
+        <w:t>empresa</w:t>
+      </w:r>
+      <w:proofErr w:type="spellEnd"/>
+      <w:r>
+        <w:rPr>
+          <w:rFonts w:cstheme="minorHAnsi"/>
+          <w:sz w:val="24"/>
+          <w:szCs w:val="24"/>
+          <w:lang w:eastAsia="es-CO"/>
+        </w:rPr>
+        <w:t xml:space="preserve"> </w:t>
+      </w:r>
+      <w:proofErr w:type="spellStart"/>
+      <w:r>
+        <w:rPr>
+          <w:rFonts w:cstheme="minorHAnsi"/>
+          <w:sz w:val="24"/>
+          <w:szCs w:val="24"/>
+          <w:lang w:eastAsia="es-CO"/>
+        </w:rPr>
+        <w:t>ficticia</w:t>
+      </w:r>
+      <w:proofErr w:type="spellEnd"/>
+      <w:r>
+        <w:rPr>
+          <w:rFonts w:cstheme="minorHAnsi"/>
+          <w:sz w:val="24"/>
+          <w:szCs w:val="24"/>
+          <w:lang w:eastAsia="es-CO"/>
+        </w:rPr>
+        <w:t xml:space="preserve"> </w:t>
+      </w:r>
+      <w:proofErr w:type="spellStart"/>
+      <w:r>
+        <w:rPr>
+          <w:rFonts w:cstheme="minorHAnsi"/>
+          <w:sz w:val="24"/>
+          <w:szCs w:val="24"/>
+          <w:lang w:eastAsia="es-CO"/>
+        </w:rPr>
+        <w:t>denominada</w:t>
+      </w:r>
+      <w:proofErr w:type="spellEnd"/>
+      <w:r>
+        <w:rPr>
+          <w:rFonts w:cstheme="minorHAnsi"/>
+          <w:sz w:val="24"/>
+          <w:szCs w:val="24"/>
+          <w:lang w:eastAsia="es-CO"/>
+        </w:rPr>
+        <w:t xml:space="preserve"> Software FJ. El </w:t>
+      </w:r>
+      <w:proofErr w:type="spellStart"/>
+      <w:r>
+        <w:rPr>
+          <w:rFonts w:cstheme="minorHAnsi"/>
+          <w:sz w:val="24"/>
+          <w:szCs w:val="24"/>
+          <w:lang w:eastAsia="es-CO"/>
+        </w:rPr>
+        <w:t>propósito</w:t>
+      </w:r>
+      <w:proofErr w:type="spellEnd"/>
+      <w:r>
+        <w:rPr>
+          <w:rFonts w:cstheme="minorHAnsi"/>
+          <w:sz w:val="24"/>
+          <w:szCs w:val="24"/>
+          <w:lang w:eastAsia="es-CO"/>
+        </w:rPr>
+        <w:t xml:space="preserve"> principal es </w:t>
+      </w:r>
+      <w:proofErr w:type="spellStart"/>
+      <w:r>
+        <w:rPr>
+          <w:rFonts w:cstheme="minorHAnsi"/>
+          <w:sz w:val="24"/>
+          <w:szCs w:val="24"/>
+          <w:lang w:eastAsia="es-CO"/>
+        </w:rPr>
+        <w:t>aplicar</w:t>
+      </w:r>
+      <w:proofErr w:type="spellEnd"/>
+      <w:r>
+        <w:rPr>
+          <w:rFonts w:cstheme="minorHAnsi"/>
+          <w:sz w:val="24"/>
+          <w:szCs w:val="24"/>
+          <w:lang w:eastAsia="es-CO"/>
+        </w:rPr>
+        <w:t xml:space="preserve"> </w:t>
+      </w:r>
+      <w:proofErr w:type="spellStart"/>
+      <w:r>
+        <w:rPr>
+          <w:rFonts w:cstheme="minorHAnsi"/>
+          <w:sz w:val="24"/>
+          <w:szCs w:val="24"/>
+          <w:lang w:eastAsia="es-CO"/>
+        </w:rPr>
+        <w:t>conceptos</w:t>
+      </w:r>
+      <w:proofErr w:type="spellEnd"/>
+      <w:r>
+        <w:rPr>
+          <w:rFonts w:cstheme="minorHAnsi"/>
+          <w:sz w:val="24"/>
+          <w:szCs w:val="24"/>
+          <w:lang w:eastAsia="es-CO"/>
+        </w:rPr>
+        <w:t xml:space="preserve"> </w:t>
+      </w:r>
+      <w:proofErr w:type="spellStart"/>
+      <w:r>
+        <w:rPr>
+          <w:rFonts w:cstheme="minorHAnsi"/>
+          <w:sz w:val="24"/>
+          <w:szCs w:val="24"/>
+          <w:lang w:eastAsia="es-CO"/>
+        </w:rPr>
+        <w:t>fundamentales</w:t>
+      </w:r>
+      <w:proofErr w:type="spellEnd"/>
+      <w:r>
+        <w:rPr>
+          <w:rFonts w:cstheme="minorHAnsi"/>
+          <w:sz w:val="24"/>
+          <w:szCs w:val="24"/>
+          <w:lang w:eastAsia="es-CO"/>
+        </w:rPr>
+        <w:t xml:space="preserve"> de la </w:t>
+      </w:r>
+      <w:proofErr w:type="spellStart"/>
+      <w:r>
+        <w:rPr>
+          <w:rFonts w:cstheme="minorHAnsi"/>
+          <w:sz w:val="24"/>
+          <w:szCs w:val="24"/>
+          <w:lang w:eastAsia="es-CO"/>
+        </w:rPr>
+        <w:t>Programación</w:t>
+      </w:r>
+      <w:proofErr w:type="spellEnd"/>
+      <w:r>
+        <w:rPr>
+          <w:rFonts w:cstheme="minorHAnsi"/>
+          <w:sz w:val="24"/>
+          <w:szCs w:val="24"/>
+          <w:lang w:eastAsia="es-CO"/>
+        </w:rPr>
+        <w:t xml:space="preserve"> </w:t>
+      </w:r>
+      <w:proofErr w:type="spellStart"/>
+      <w:r>
+        <w:rPr>
+          <w:rFonts w:cstheme="minorHAnsi"/>
+          <w:sz w:val="24"/>
+          <w:szCs w:val="24"/>
+          <w:lang w:eastAsia="es-CO"/>
+        </w:rPr>
+        <w:t>Orientada</w:t>
+      </w:r>
+      <w:proofErr w:type="spellEnd"/>
+      <w:r>
+        <w:rPr>
+          <w:rFonts w:cstheme="minorHAnsi"/>
+          <w:sz w:val="24"/>
+          <w:szCs w:val="24"/>
+          <w:lang w:eastAsia="es-CO"/>
+        </w:rPr>
+        <w:t xml:space="preserve"> a </w:t>
+      </w:r>
+      <w:proofErr w:type="spellStart"/>
+      <w:r>
+        <w:rPr>
+          <w:rFonts w:cstheme="minorHAnsi"/>
+          <w:sz w:val="24"/>
+          <w:szCs w:val="24"/>
+          <w:lang w:eastAsia="es-CO"/>
+        </w:rPr>
+        <w:t>Objetos</w:t>
+      </w:r>
+      <w:proofErr w:type="spellEnd"/>
+      <w:r>
+        <w:rPr>
+          <w:rFonts w:cstheme="minorHAnsi"/>
+          <w:sz w:val="24"/>
+          <w:szCs w:val="24"/>
+          <w:lang w:eastAsia="es-CO"/>
+        </w:rPr>
+        <w:t xml:space="preserve"> (POO), tales </w:t>
+      </w:r>
+      <w:proofErr w:type="spellStart"/>
+      <w:r>
+        <w:rPr>
+          <w:rFonts w:cstheme="minorHAnsi"/>
+          <w:sz w:val="24"/>
+          <w:szCs w:val="24"/>
+          <w:lang w:eastAsia="es-CO"/>
+        </w:rPr>
+        <w:t>como</w:t>
+      </w:r>
+      <w:proofErr w:type="spellEnd"/>
+      <w:r>
+        <w:rPr>
+          <w:rFonts w:cstheme="minorHAnsi"/>
+          <w:sz w:val="24"/>
+          <w:szCs w:val="24"/>
+          <w:lang w:eastAsia="es-CO"/>
+        </w:rPr>
+        <w:t xml:space="preserve"> </w:t>
+      </w:r>
+      <w:proofErr w:type="spellStart"/>
+      <w:r>
+        <w:rPr>
+          <w:rFonts w:cstheme="minorHAnsi"/>
+          <w:sz w:val="24"/>
+          <w:szCs w:val="24"/>
+          <w:lang w:eastAsia="es-CO"/>
+        </w:rPr>
+        <w:t>abstracción</w:t>
+      </w:r>
+      <w:proofErr w:type="spellEnd"/>
+      <w:r>
+        <w:rPr>
+          <w:rFonts w:cstheme="minorHAnsi"/>
+          <w:sz w:val="24"/>
+          <w:szCs w:val="24"/>
+          <w:lang w:eastAsia="es-CO"/>
+        </w:rPr>
+        <w:t xml:space="preserve">, </w:t>
+      </w:r>
+      <w:proofErr w:type="spellStart"/>
+      <w:r>
+        <w:rPr>
+          <w:rFonts w:cstheme="minorHAnsi"/>
+          <w:sz w:val="24"/>
+          <w:szCs w:val="24"/>
+          <w:lang w:eastAsia="es-CO"/>
+        </w:rPr>
+        <w:t>encapsulación</w:t>
+      </w:r>
+      <w:proofErr w:type="spellEnd"/>
+      <w:r>
+        <w:rPr>
+          <w:rFonts w:cstheme="minorHAnsi"/>
+          <w:sz w:val="24"/>
+          <w:szCs w:val="24"/>
+          <w:lang w:eastAsia="es-CO"/>
+        </w:rPr>
+        <w:t xml:space="preserve">, </w:t>
+      </w:r>
+      <w:proofErr w:type="spellStart"/>
+      <w:r>
+        <w:rPr>
+          <w:rFonts w:cstheme="minorHAnsi"/>
+          <w:sz w:val="24"/>
+          <w:szCs w:val="24"/>
+          <w:lang w:eastAsia="es-CO"/>
+        </w:rPr>
+        <w:t>herencia</w:t>
+      </w:r>
+      <w:proofErr w:type="spellEnd"/>
+      <w:r>
+        <w:rPr>
+          <w:rFonts w:cstheme="minorHAnsi"/>
+          <w:sz w:val="24"/>
+          <w:szCs w:val="24"/>
+          <w:lang w:eastAsia="es-CO"/>
+        </w:rPr>
+        <w:t xml:space="preserve"> y </w:t>
+      </w:r>
+      <w:proofErr w:type="spellStart"/>
+      <w:r>
+        <w:rPr>
+          <w:rFonts w:cstheme="minorHAnsi"/>
+          <w:sz w:val="24"/>
+          <w:szCs w:val="24"/>
+          <w:lang w:eastAsia="es-CO"/>
+        </w:rPr>
+        <w:t>polimorfismo</w:t>
+      </w:r>
+      <w:proofErr w:type="spellEnd"/>
+      <w:r>
+        <w:rPr>
+          <w:rFonts w:cstheme="minorHAnsi"/>
+          <w:sz w:val="24"/>
+          <w:szCs w:val="24"/>
+          <w:lang w:eastAsia="es-CO"/>
+        </w:rPr>
+        <w:t xml:space="preserve">, junto con </w:t>
+      </w:r>
+      <w:proofErr w:type="spellStart"/>
+      <w:r>
+        <w:rPr>
+          <w:rFonts w:cstheme="minorHAnsi"/>
+          <w:sz w:val="24"/>
+          <w:szCs w:val="24"/>
+          <w:lang w:eastAsia="es-CO"/>
+        </w:rPr>
+        <w:t>el</w:t>
+      </w:r>
+      <w:proofErr w:type="spellEnd"/>
+      <w:r>
+        <w:rPr>
+          <w:rFonts w:cstheme="minorHAnsi"/>
+          <w:sz w:val="24"/>
+          <w:szCs w:val="24"/>
+          <w:lang w:eastAsia="es-CO"/>
+        </w:rPr>
+        <w:t xml:space="preserve"> </w:t>
+      </w:r>
+      <w:proofErr w:type="spellStart"/>
+      <w:r>
+        <w:rPr>
+          <w:rFonts w:cstheme="minorHAnsi"/>
+          <w:sz w:val="24"/>
+          <w:szCs w:val="24"/>
+          <w:lang w:eastAsia="es-CO"/>
+        </w:rPr>
+        <w:t>manejo</w:t>
+      </w:r>
+      <w:proofErr w:type="spellEnd"/>
+      <w:r>
+        <w:rPr>
+          <w:rFonts w:cstheme="minorHAnsi"/>
+          <w:sz w:val="24"/>
+          <w:szCs w:val="24"/>
+          <w:lang w:eastAsia="es-CO"/>
+        </w:rPr>
+        <w:t xml:space="preserve"> </w:t>
+      </w:r>
+      <w:proofErr w:type="spellStart"/>
+      <w:r>
+        <w:rPr>
+          <w:rFonts w:cstheme="minorHAnsi"/>
+          <w:sz w:val="24"/>
+          <w:szCs w:val="24"/>
+          <w:lang w:eastAsia="es-CO"/>
+        </w:rPr>
+        <w:t>avanzado</w:t>
+      </w:r>
+      <w:proofErr w:type="spellEnd"/>
+      <w:r>
+        <w:rPr>
+          <w:rFonts w:cstheme="minorHAnsi"/>
+          <w:sz w:val="24"/>
+          <w:szCs w:val="24"/>
+          <w:lang w:eastAsia="es-CO"/>
+        </w:rPr>
+        <w:t xml:space="preserve"> de </w:t>
+      </w:r>
+      <w:proofErr w:type="spellStart"/>
+      <w:r>
+        <w:rPr>
+          <w:rFonts w:cstheme="minorHAnsi"/>
+          <w:sz w:val="24"/>
+          <w:szCs w:val="24"/>
+          <w:lang w:eastAsia="es-CO"/>
+        </w:rPr>
+        <w:t>excepciones</w:t>
+      </w:r>
+      <w:proofErr w:type="spellEnd"/>
+      <w:r>
+        <w:rPr>
+          <w:rFonts w:cstheme="minorHAnsi"/>
+          <w:sz w:val="24"/>
+          <w:szCs w:val="24"/>
+          <w:lang w:eastAsia="es-CO"/>
+        </w:rPr>
+        <w:t>.</w:t>
       </w:r>
     </w:p>
     <w:p>
@@ -855,14 +1616,665 @@
           <w:lang w:eastAsia="es-CO"/>
         </w:rPr>
       </w:pPr>
-      <w:r>
-        <w:rPr>
-          <w:rFonts w:cstheme="minorHAnsi"/>
-          <w:sz w:val="24"/>
-          <w:szCs w:val="24"/>
-          <w:lang w:eastAsia="es-CO"/>
-        </w:rPr>
-        <w:t>Adicionalmente, el sistema busca garantizar estabilidad y robustez ante posibles errores durante su ejecución, mediante el uso de estructuras de control como try/except, excepciones personalizadas y registro de eventos en archivos de log. Todo esto se desarrolla sin el uso de bases de datos, empleando únicamente listas y archivos.</w:t>
+      <w:proofErr w:type="spellStart"/>
+      <w:r>
+        <w:rPr>
+          <w:rFonts w:cstheme="minorHAnsi"/>
+          <w:sz w:val="24"/>
+          <w:szCs w:val="24"/>
+          <w:lang w:eastAsia="es-CO"/>
+        </w:rPr>
+        <w:t>Adicionalmente</w:t>
+      </w:r>
+      <w:proofErr w:type="spellEnd"/>
+      <w:r>
+        <w:rPr>
+          <w:rFonts w:cstheme="minorHAnsi"/>
+          <w:sz w:val="24"/>
+          <w:szCs w:val="24"/>
+          <w:lang w:eastAsia="es-CO"/>
+        </w:rPr>
+        <w:t xml:space="preserve">, </w:t>
+      </w:r>
+      <w:proofErr w:type="spellStart"/>
+      <w:r>
+        <w:rPr>
+          <w:rFonts w:cstheme="minorHAnsi"/>
+          <w:sz w:val="24"/>
+          <w:szCs w:val="24"/>
+          <w:lang w:eastAsia="es-CO"/>
+        </w:rPr>
+        <w:t>el</w:t>
+      </w:r>
+      <w:proofErr w:type="spellEnd"/>
+      <w:r>
+        <w:rPr>
+          <w:rFonts w:cstheme="minorHAnsi"/>
+          <w:sz w:val="24"/>
+          <w:szCs w:val="24"/>
+          <w:lang w:eastAsia="es-CO"/>
+        </w:rPr>
+        <w:t xml:space="preserve"> </w:t>
+      </w:r>
+      <w:proofErr w:type="spellStart"/>
+      <w:r>
+        <w:rPr>
+          <w:rFonts w:cstheme="minorHAnsi"/>
+          <w:sz w:val="24"/>
+          <w:szCs w:val="24"/>
+          <w:lang w:eastAsia="es-CO"/>
+        </w:rPr>
+        <w:t>sistema</w:t>
+      </w:r>
+      <w:proofErr w:type="spellEnd"/>
+      <w:r>
+        <w:rPr>
+          <w:rFonts w:cstheme="minorHAnsi"/>
+          <w:sz w:val="24"/>
+          <w:szCs w:val="24"/>
+          <w:lang w:eastAsia="es-CO"/>
+        </w:rPr>
+        <w:t xml:space="preserve"> </w:t>
+      </w:r>
+      <w:proofErr w:type="spellStart"/>
+      <w:r>
+        <w:rPr>
+          <w:rFonts w:cstheme="minorHAnsi"/>
+          <w:sz w:val="24"/>
+          <w:szCs w:val="24"/>
+          <w:lang w:eastAsia="es-CO"/>
+        </w:rPr>
+        <w:t>busca</w:t>
+      </w:r>
+      <w:proofErr w:type="spellEnd"/>
+      <w:r>
+        <w:rPr>
+          <w:rFonts w:cstheme="minorHAnsi"/>
+          <w:sz w:val="24"/>
+          <w:szCs w:val="24"/>
+          <w:lang w:eastAsia="es-CO"/>
+        </w:rPr>
+        <w:t xml:space="preserve"> </w:t>
+      </w:r>
+      <w:proofErr w:type="spellStart"/>
+      <w:r>
+        <w:rPr>
+          <w:rFonts w:cstheme="minorHAnsi"/>
+          <w:sz w:val="24"/>
+          <w:szCs w:val="24"/>
+          <w:lang w:eastAsia="es-CO"/>
+        </w:rPr>
+        <w:t>garantizar</w:t>
+      </w:r>
+      <w:proofErr w:type="spellEnd"/>
+      <w:r>
+        <w:rPr>
+          <w:rFonts w:cstheme="minorHAnsi"/>
+          <w:sz w:val="24"/>
+          <w:szCs w:val="24"/>
+          <w:lang w:eastAsia="es-CO"/>
+        </w:rPr>
+        <w:t xml:space="preserve"> </w:t>
+      </w:r>
+      <w:proofErr w:type="spellStart"/>
+      <w:r>
+        <w:rPr>
+          <w:rFonts w:cstheme="minorHAnsi"/>
+          <w:sz w:val="24"/>
+          <w:szCs w:val="24"/>
+          <w:lang w:eastAsia="es-CO"/>
+        </w:rPr>
+        <w:t>estabilidad</w:t>
+      </w:r>
+      <w:proofErr w:type="spellEnd"/>
+      <w:r>
+        <w:rPr>
+          <w:rFonts w:cstheme="minorHAnsi"/>
+          <w:sz w:val="24"/>
+          <w:szCs w:val="24"/>
+          <w:lang w:eastAsia="es-CO"/>
+        </w:rPr>
+        <w:t xml:space="preserve"> y </w:t>
+      </w:r>
+      <w:proofErr w:type="spellStart"/>
+      <w:r>
+        <w:rPr>
+          <w:rFonts w:cstheme="minorHAnsi"/>
+          <w:sz w:val="24"/>
+          <w:szCs w:val="24"/>
+          <w:lang w:eastAsia="es-CO"/>
+        </w:rPr>
+        <w:t>robustez</w:t>
+      </w:r>
+      <w:proofErr w:type="spellEnd"/>
+      <w:r>
+        <w:rPr>
+          <w:rFonts w:cstheme="minorHAnsi"/>
+          <w:sz w:val="24"/>
+          <w:szCs w:val="24"/>
+          <w:lang w:eastAsia="es-CO"/>
+        </w:rPr>
+        <w:t xml:space="preserve"> ante </w:t>
+      </w:r>
+      <w:proofErr w:type="spellStart"/>
+      <w:r>
+        <w:rPr>
+          <w:rFonts w:cstheme="minorHAnsi"/>
+          <w:sz w:val="24"/>
+          <w:szCs w:val="24"/>
+          <w:lang w:eastAsia="es-CO"/>
+        </w:rPr>
+        <w:t>posibles</w:t>
+      </w:r>
+      <w:proofErr w:type="spellEnd"/>
+      <w:r>
+        <w:rPr>
+          <w:rFonts w:cstheme="minorHAnsi"/>
+          <w:sz w:val="24"/>
+          <w:szCs w:val="24"/>
+          <w:lang w:eastAsia="es-CO"/>
+        </w:rPr>
+        <w:t xml:space="preserve"> </w:t>
+      </w:r>
+      <w:proofErr w:type="spellStart"/>
+      <w:r>
+        <w:rPr>
+          <w:rFonts w:cstheme="minorHAnsi"/>
+          <w:sz w:val="24"/>
+          <w:szCs w:val="24"/>
+          <w:lang w:eastAsia="es-CO"/>
+        </w:rPr>
+        <w:t>errores</w:t>
+      </w:r>
+      <w:proofErr w:type="spellEnd"/>
+      <w:r>
+        <w:rPr>
+          <w:rFonts w:cstheme="minorHAnsi"/>
+          <w:sz w:val="24"/>
+          <w:szCs w:val="24"/>
+          <w:lang w:eastAsia="es-CO"/>
+        </w:rPr>
+        <w:t xml:space="preserve"> </w:t>
+      </w:r>
+      <w:proofErr w:type="spellStart"/>
+      <w:r>
+        <w:rPr>
+          <w:rFonts w:cstheme="minorHAnsi"/>
+          <w:sz w:val="24"/>
+          <w:szCs w:val="24"/>
+          <w:lang w:eastAsia="es-CO"/>
+        </w:rPr>
+        <w:t>durante</w:t>
+      </w:r>
+      <w:proofErr w:type="spellEnd"/>
+      <w:r>
+        <w:rPr>
+          <w:rFonts w:cstheme="minorHAnsi"/>
+          <w:sz w:val="24"/>
+          <w:szCs w:val="24"/>
+          <w:lang w:eastAsia="es-CO"/>
+        </w:rPr>
+        <w:t xml:space="preserve"> </w:t>
+      </w:r>
+      <w:proofErr w:type="spellStart"/>
+      <w:r>
+        <w:rPr>
+          <w:rFonts w:cstheme="minorHAnsi"/>
+          <w:sz w:val="24"/>
+          <w:szCs w:val="24"/>
+          <w:lang w:eastAsia="es-CO"/>
+        </w:rPr>
+        <w:t>su</w:t>
+      </w:r>
+      <w:proofErr w:type="spellEnd"/>
+      <w:r>
+        <w:rPr>
+          <w:rFonts w:cstheme="minorHAnsi"/>
+          <w:sz w:val="24"/>
+          <w:szCs w:val="24"/>
+          <w:lang w:eastAsia="es-CO"/>
+        </w:rPr>
+        <w:t xml:space="preserve"> </w:t>
+      </w:r>
+      <w:proofErr w:type="spellStart"/>
+      <w:r>
+        <w:rPr>
+          <w:rFonts w:cstheme="minorHAnsi"/>
+          <w:sz w:val="24"/>
+          <w:szCs w:val="24"/>
+          <w:lang w:eastAsia="es-CO"/>
+        </w:rPr>
+        <w:t>ejecución</w:t>
+      </w:r>
+      <w:proofErr w:type="spellEnd"/>
+      <w:r>
+        <w:rPr>
+          <w:rFonts w:cstheme="minorHAnsi"/>
+          <w:sz w:val="24"/>
+          <w:szCs w:val="24"/>
+          <w:lang w:eastAsia="es-CO"/>
+        </w:rPr>
+        <w:t xml:space="preserve">, </w:t>
+      </w:r>
+      <w:proofErr w:type="spellStart"/>
+      <w:r>
+        <w:rPr>
+          <w:rFonts w:cstheme="minorHAnsi"/>
+          <w:sz w:val="24"/>
+          <w:szCs w:val="24"/>
+          <w:lang w:eastAsia="es-CO"/>
+        </w:rPr>
+        <w:t>mediante</w:t>
+      </w:r>
+      <w:proofErr w:type="spellEnd"/>
+      <w:r>
+        <w:rPr>
+          <w:rFonts w:cstheme="minorHAnsi"/>
+          <w:sz w:val="24"/>
+          <w:szCs w:val="24"/>
+          <w:lang w:eastAsia="es-CO"/>
+        </w:rPr>
+        <w:t xml:space="preserve"> </w:t>
+      </w:r>
+      <w:proofErr w:type="spellStart"/>
+      <w:r>
+        <w:rPr>
+          <w:rFonts w:cstheme="minorHAnsi"/>
+          <w:sz w:val="24"/>
+          <w:szCs w:val="24"/>
+          <w:lang w:eastAsia="es-CO"/>
+        </w:rPr>
+        <w:t>el</w:t>
+      </w:r>
+      <w:proofErr w:type="spellEnd"/>
+      <w:r>
+        <w:rPr>
+          <w:rFonts w:cstheme="minorHAnsi"/>
+          <w:sz w:val="24"/>
+          <w:szCs w:val="24"/>
+          <w:lang w:eastAsia="es-CO"/>
+        </w:rPr>
+        <w:t xml:space="preserve"> </w:t>
+      </w:r>
+      <w:proofErr w:type="spellStart"/>
+      <w:r>
+        <w:rPr>
+          <w:rFonts w:cstheme="minorHAnsi"/>
+          <w:sz w:val="24"/>
+          <w:szCs w:val="24"/>
+          <w:lang w:eastAsia="es-CO"/>
+        </w:rPr>
+        <w:t>uso</w:t>
+      </w:r>
+      <w:proofErr w:type="spellEnd"/>
+      <w:r>
+        <w:rPr>
+          <w:rFonts w:cstheme="minorHAnsi"/>
+          <w:sz w:val="24"/>
+          <w:szCs w:val="24"/>
+          <w:lang w:eastAsia="es-CO"/>
+        </w:rPr>
+        <w:t xml:space="preserve"> de </w:t>
+      </w:r>
+      <w:proofErr w:type="spellStart"/>
+      <w:r>
+        <w:rPr>
+          <w:rFonts w:cstheme="minorHAnsi"/>
+          <w:sz w:val="24"/>
+          <w:szCs w:val="24"/>
+          <w:lang w:eastAsia="es-CO"/>
+        </w:rPr>
+        <w:t>estructuras</w:t>
+      </w:r>
+      <w:proofErr w:type="spellEnd"/>
+      <w:r>
+        <w:rPr>
+          <w:rFonts w:cstheme="minorHAnsi"/>
+          <w:sz w:val="24"/>
+          <w:szCs w:val="24"/>
+          <w:lang w:eastAsia="es-CO"/>
+        </w:rPr>
+        <w:t xml:space="preserve"> de control </w:t>
+      </w:r>
+      <w:proofErr w:type="spellStart"/>
+      <w:r>
+        <w:rPr>
+          <w:rFonts w:cstheme="minorHAnsi"/>
+          <w:sz w:val="24"/>
+          <w:szCs w:val="24"/>
+          <w:lang w:eastAsia="es-CO"/>
+        </w:rPr>
+        <w:t>como</w:t>
+      </w:r>
+      <w:proofErr w:type="spellEnd"/>
+      <w:r>
+        <w:rPr>
+          <w:rFonts w:cstheme="minorHAnsi"/>
+          <w:sz w:val="24"/>
+          <w:szCs w:val="24"/>
+          <w:lang w:eastAsia="es-CO"/>
+        </w:rPr>
+        <w:t xml:space="preserve"> try/except, </w:t>
+      </w:r>
+      <w:proofErr w:type="spellStart"/>
+      <w:r>
+        <w:rPr>
+          <w:rFonts w:cstheme="minorHAnsi"/>
+          <w:sz w:val="24"/>
+          <w:szCs w:val="24"/>
+          <w:lang w:eastAsia="es-CO"/>
+        </w:rPr>
+        <w:t>excepciones</w:t>
+      </w:r>
+      <w:proofErr w:type="spellEnd"/>
+      <w:r>
+        <w:rPr>
+          <w:rFonts w:cstheme="minorHAnsi"/>
+          <w:sz w:val="24"/>
+          <w:szCs w:val="24"/>
+          <w:lang w:eastAsia="es-CO"/>
+        </w:rPr>
+        <w:t xml:space="preserve"> </w:t>
+      </w:r>
+      <w:proofErr w:type="spellStart"/>
+      <w:r>
+        <w:rPr>
+          <w:rFonts w:cstheme="minorHAnsi"/>
+          <w:sz w:val="24"/>
+          <w:szCs w:val="24"/>
+          <w:lang w:eastAsia="es-CO"/>
+        </w:rPr>
+        <w:t>personalizadas</w:t>
+      </w:r>
+      <w:proofErr w:type="spellEnd"/>
+      <w:r>
+        <w:rPr>
+          <w:rFonts w:cstheme="minorHAnsi"/>
+          <w:sz w:val="24"/>
+          <w:szCs w:val="24"/>
+          <w:lang w:eastAsia="es-CO"/>
+        </w:rPr>
+        <w:t xml:space="preserve"> y </w:t>
+      </w:r>
+      <w:proofErr w:type="spellStart"/>
+      <w:r>
+        <w:rPr>
+          <w:rFonts w:cstheme="minorHAnsi"/>
+          <w:sz w:val="24"/>
+          <w:szCs w:val="24"/>
+          <w:lang w:eastAsia="es-CO"/>
+        </w:rPr>
+        <w:t>registro</w:t>
+      </w:r>
+      <w:proofErr w:type="spellEnd"/>
+      <w:r>
+        <w:rPr>
+          <w:rFonts w:cstheme="minorHAnsi"/>
+          <w:sz w:val="24"/>
+          <w:szCs w:val="24"/>
+          <w:lang w:eastAsia="es-CO"/>
+        </w:rPr>
+        <w:t xml:space="preserve"> de </w:t>
+      </w:r>
+      <w:proofErr w:type="spellStart"/>
+      <w:r>
+        <w:rPr>
+          <w:rFonts w:cstheme="minorHAnsi"/>
+          <w:sz w:val="24"/>
+          <w:szCs w:val="24"/>
+          <w:lang w:eastAsia="es-CO"/>
+        </w:rPr>
+        <w:t>eventos</w:t>
+      </w:r>
+      <w:proofErr w:type="spellEnd"/>
+      <w:r>
+        <w:rPr>
+          <w:rFonts w:cstheme="minorHAnsi"/>
+          <w:sz w:val="24"/>
+          <w:szCs w:val="24"/>
+          <w:lang w:eastAsia="es-CO"/>
+        </w:rPr>
+        <w:t xml:space="preserve"> </w:t>
+      </w:r>
+      <w:proofErr w:type="spellStart"/>
+      <w:r>
+        <w:rPr>
+          <w:rFonts w:cstheme="minorHAnsi"/>
+          <w:sz w:val="24"/>
+          <w:szCs w:val="24"/>
+          <w:lang w:eastAsia="es-CO"/>
+        </w:rPr>
+        <w:t>en</w:t>
+      </w:r>
+      <w:proofErr w:type="spellEnd"/>
+      <w:r>
+        <w:rPr>
+          <w:rFonts w:cstheme="minorHAnsi"/>
+          <w:sz w:val="24"/>
+          <w:szCs w:val="24"/>
+          <w:lang w:eastAsia="es-CO"/>
+        </w:rPr>
+        <w:t xml:space="preserve"> </w:t>
+      </w:r>
+      <w:proofErr w:type="spellStart"/>
+      <w:r>
+        <w:rPr>
+          <w:rFonts w:cstheme="minorHAnsi"/>
+          <w:sz w:val="24"/>
+          <w:szCs w:val="24"/>
+          <w:lang w:eastAsia="es-CO"/>
+        </w:rPr>
+        <w:t>archivos</w:t>
+      </w:r>
+      <w:proofErr w:type="spellEnd"/>
+      <w:r>
+        <w:rPr>
+          <w:rFonts w:cstheme="minorHAnsi"/>
+          <w:sz w:val="24"/>
+          <w:szCs w:val="24"/>
+          <w:lang w:eastAsia="es-CO"/>
+        </w:rPr>
+        <w:t xml:space="preserve"> de log. </w:t>
+      </w:r>
+      <w:proofErr w:type="spellStart"/>
+      <w:r>
+        <w:rPr>
+          <w:rFonts w:cstheme="minorHAnsi"/>
+          <w:sz w:val="24"/>
+          <w:szCs w:val="24"/>
+          <w:lang w:eastAsia="es-CO"/>
+        </w:rPr>
+        <w:t>Todo</w:t>
+      </w:r>
+      <w:proofErr w:type="spellEnd"/>
+      <w:r>
+        <w:rPr>
+          <w:rFonts w:cstheme="minorHAnsi"/>
+          <w:sz w:val="24"/>
+          <w:szCs w:val="24"/>
+          <w:lang w:eastAsia="es-CO"/>
+        </w:rPr>
+        <w:t xml:space="preserve"> </w:t>
+      </w:r>
+      <w:proofErr w:type="spellStart"/>
+      <w:r>
+        <w:rPr>
+          <w:rFonts w:cstheme="minorHAnsi"/>
+          <w:sz w:val="24"/>
+          <w:szCs w:val="24"/>
+          <w:lang w:eastAsia="es-CO"/>
+        </w:rPr>
+        <w:t>esto</w:t>
+      </w:r>
+      <w:proofErr w:type="spellEnd"/>
+      <w:r>
+        <w:rPr>
+          <w:rFonts w:cstheme="minorHAnsi"/>
+          <w:sz w:val="24"/>
+          <w:szCs w:val="24"/>
+          <w:lang w:eastAsia="es-CO"/>
+        </w:rPr>
+        <w:t xml:space="preserve"> se </w:t>
+      </w:r>
+      <w:proofErr w:type="spellStart"/>
+      <w:r>
+        <w:rPr>
+          <w:rFonts w:cstheme="minorHAnsi"/>
+          <w:sz w:val="24"/>
+          <w:szCs w:val="24"/>
+          <w:lang w:eastAsia="es-CO"/>
+        </w:rPr>
+        <w:t>desarrolla</w:t>
+      </w:r>
+      <w:proofErr w:type="spellEnd"/>
+      <w:r>
+        <w:rPr>
+          <w:rFonts w:cstheme="minorHAnsi"/>
+          <w:sz w:val="24"/>
+          <w:szCs w:val="24"/>
+          <w:lang w:eastAsia="es-CO"/>
+        </w:rPr>
+        <w:t xml:space="preserve"> sin </w:t>
+      </w:r>
+      <w:proofErr w:type="spellStart"/>
+      <w:r>
+        <w:rPr>
+          <w:rFonts w:cstheme="minorHAnsi"/>
+          <w:sz w:val="24"/>
+          <w:szCs w:val="24"/>
+          <w:lang w:eastAsia="es-CO"/>
+        </w:rPr>
+        <w:t>el</w:t>
+      </w:r>
+      <w:proofErr w:type="spellEnd"/>
+      <w:r>
+        <w:rPr>
+          <w:rFonts w:cstheme="minorHAnsi"/>
+          <w:sz w:val="24"/>
+          <w:szCs w:val="24"/>
+          <w:lang w:eastAsia="es-CO"/>
+        </w:rPr>
+        <w:t xml:space="preserve"> </w:t>
+      </w:r>
+      <w:proofErr w:type="spellStart"/>
+      <w:r>
+        <w:rPr>
+          <w:rFonts w:cstheme="minorHAnsi"/>
+          <w:sz w:val="24"/>
+          <w:szCs w:val="24"/>
+          <w:lang w:eastAsia="es-CO"/>
+        </w:rPr>
+        <w:t>uso</w:t>
+      </w:r>
+      <w:proofErr w:type="spellEnd"/>
+      <w:r>
+        <w:rPr>
+          <w:rFonts w:cstheme="minorHAnsi"/>
+          <w:sz w:val="24"/>
+          <w:szCs w:val="24"/>
+          <w:lang w:eastAsia="es-CO"/>
+        </w:rPr>
+        <w:t xml:space="preserve"> de bases de </w:t>
+      </w:r>
+      <w:proofErr w:type="spellStart"/>
+      <w:r>
+        <w:rPr>
+          <w:rFonts w:cstheme="minorHAnsi"/>
+          <w:sz w:val="24"/>
+          <w:szCs w:val="24"/>
+          <w:lang w:eastAsia="es-CO"/>
+        </w:rPr>
+        <w:t>datos</w:t>
+      </w:r>
+      <w:proofErr w:type="spellEnd"/>
+      <w:r>
+        <w:rPr>
+          <w:rFonts w:cstheme="minorHAnsi"/>
+          <w:sz w:val="24"/>
+          <w:szCs w:val="24"/>
+          <w:lang w:eastAsia="es-CO"/>
+        </w:rPr>
+        <w:t xml:space="preserve">, </w:t>
+      </w:r>
+      <w:proofErr w:type="spellStart"/>
+      <w:r>
+        <w:rPr>
+          <w:rFonts w:cstheme="minorHAnsi"/>
+          <w:sz w:val="24"/>
+          <w:szCs w:val="24"/>
+          <w:lang w:eastAsia="es-CO"/>
+        </w:rPr>
+        <w:t>empleando</w:t>
+      </w:r>
+      <w:proofErr w:type="spellEnd"/>
+      <w:r>
+        <w:rPr>
+          <w:rFonts w:cstheme="minorHAnsi"/>
+          <w:sz w:val="24"/>
+          <w:szCs w:val="24"/>
+          <w:lang w:eastAsia="es-CO"/>
+        </w:rPr>
+        <w:t xml:space="preserve"> </w:t>
+      </w:r>
+      <w:proofErr w:type="spellStart"/>
+      <w:r>
+        <w:rPr>
+          <w:rFonts w:cstheme="minorHAnsi"/>
+          <w:sz w:val="24"/>
+          <w:szCs w:val="24"/>
+          <w:lang w:eastAsia="es-CO"/>
+        </w:rPr>
+        <w:t>únicamente</w:t>
+      </w:r>
+      <w:proofErr w:type="spellEnd"/>
+      <w:r>
+        <w:rPr>
+          <w:rFonts w:cstheme="minorHAnsi"/>
+          <w:sz w:val="24"/>
+          <w:szCs w:val="24"/>
+          <w:lang w:eastAsia="es-CO"/>
+        </w:rPr>
+        <w:t xml:space="preserve"> </w:t>
+      </w:r>
+      <w:proofErr w:type="spellStart"/>
+      <w:r>
+        <w:rPr>
+          <w:rFonts w:cstheme="minorHAnsi"/>
+          <w:sz w:val="24"/>
+          <w:szCs w:val="24"/>
+          <w:lang w:eastAsia="es-CO"/>
+        </w:rPr>
+        <w:t>listas</w:t>
+      </w:r>
+      <w:proofErr w:type="spellEnd"/>
+      <w:r>
+        <w:rPr>
+          <w:rFonts w:cstheme="minorHAnsi"/>
+          <w:sz w:val="24"/>
+          <w:szCs w:val="24"/>
+          <w:lang w:eastAsia="es-CO"/>
+        </w:rPr>
+        <w:t xml:space="preserve"> y </w:t>
+      </w:r>
+      <w:proofErr w:type="spellStart"/>
+      <w:r>
+        <w:rPr>
+          <w:rFonts w:cstheme="minorHAnsi"/>
+          <w:sz w:val="24"/>
+          <w:szCs w:val="24"/>
+          <w:lang w:eastAsia="es-CO"/>
+        </w:rPr>
+        <w:t>archivos</w:t>
+      </w:r>
+      <w:proofErr w:type="spellEnd"/>
+      <w:r>
+        <w:rPr>
+          <w:rFonts w:cstheme="minorHAnsi"/>
+          <w:sz w:val="24"/>
+          <w:szCs w:val="24"/>
+          <w:lang w:eastAsia="es-CO"/>
+        </w:rPr>
+        <w:t>.</w:t>
       </w:r>
     </w:p>
     <w:p>
@@ -882,7 +2294,267 @@
           <w:szCs w:val="24"/>
           <w:lang w:eastAsia="es-CO"/>
         </w:rPr>
-        <w:t>Este trabajo evidencia la capacidad de diseñar soluciones eficientes, organizadas y capaces de manejar fallos sin interrumpir su funcionamiento.</w:t>
+        <w:t xml:space="preserve">Este </w:t>
+      </w:r>
+      <w:proofErr w:type="spellStart"/>
+      <w:r>
+        <w:rPr>
+          <w:rFonts w:cstheme="minorHAnsi"/>
+          <w:sz w:val="24"/>
+          <w:szCs w:val="24"/>
+          <w:lang w:eastAsia="es-CO"/>
+        </w:rPr>
+        <w:t>trabajo</w:t>
+      </w:r>
+      <w:proofErr w:type="spellEnd"/>
+      <w:r>
+        <w:rPr>
+          <w:rFonts w:cstheme="minorHAnsi"/>
+          <w:sz w:val="24"/>
+          <w:szCs w:val="24"/>
+          <w:lang w:eastAsia="es-CO"/>
+        </w:rPr>
+        <w:t xml:space="preserve"> </w:t>
+      </w:r>
+      <w:proofErr w:type="spellStart"/>
+      <w:r>
+        <w:rPr>
+          <w:rFonts w:cstheme="minorHAnsi"/>
+          <w:sz w:val="24"/>
+          <w:szCs w:val="24"/>
+          <w:lang w:eastAsia="es-CO"/>
+        </w:rPr>
+        <w:t>evidencia</w:t>
+      </w:r>
+      <w:proofErr w:type="spellEnd"/>
+      <w:r>
+        <w:rPr>
+          <w:rFonts w:cstheme="minorHAnsi"/>
+          <w:sz w:val="24"/>
+          <w:szCs w:val="24"/>
+          <w:lang w:eastAsia="es-CO"/>
+        </w:rPr>
+        <w:t xml:space="preserve"> la </w:t>
+      </w:r>
+      <w:proofErr w:type="spellStart"/>
+      <w:r>
+        <w:rPr>
+          <w:rFonts w:cstheme="minorHAnsi"/>
+          <w:sz w:val="24"/>
+          <w:szCs w:val="24"/>
+          <w:lang w:eastAsia="es-CO"/>
+        </w:rPr>
+        <w:t>capacidad</w:t>
+      </w:r>
+      <w:proofErr w:type="spellEnd"/>
+      <w:r>
+        <w:rPr>
+          <w:rFonts w:cstheme="minorHAnsi"/>
+          <w:sz w:val="24"/>
+          <w:szCs w:val="24"/>
+          <w:lang w:eastAsia="es-CO"/>
+        </w:rPr>
+        <w:t xml:space="preserve"> de </w:t>
+      </w:r>
+      <w:proofErr w:type="spellStart"/>
+      <w:r>
+        <w:rPr>
+          <w:rFonts w:cstheme="minorHAnsi"/>
+          <w:sz w:val="24"/>
+          <w:szCs w:val="24"/>
+          <w:lang w:eastAsia="es-CO"/>
+        </w:rPr>
+        <w:t>diseñar</w:t>
+      </w:r>
+      <w:proofErr w:type="spellEnd"/>
+      <w:r>
+        <w:rPr>
+          <w:rFonts w:cstheme="minorHAnsi"/>
+          <w:sz w:val="24"/>
+          <w:szCs w:val="24"/>
+          <w:lang w:eastAsia="es-CO"/>
+        </w:rPr>
+        <w:t xml:space="preserve"> </w:t>
+      </w:r>
+      <w:proofErr w:type="spellStart"/>
+      <w:r>
+        <w:rPr>
+          <w:rFonts w:cstheme="minorHAnsi"/>
+          <w:sz w:val="24"/>
+          <w:szCs w:val="24"/>
+          <w:lang w:eastAsia="es-CO"/>
+        </w:rPr>
+        <w:t>soluciones</w:t>
+      </w:r>
+      <w:proofErr w:type="spellEnd"/>
+      <w:r>
+        <w:rPr>
+          <w:rFonts w:cstheme="minorHAnsi"/>
+          <w:sz w:val="24"/>
+          <w:szCs w:val="24"/>
+          <w:lang w:eastAsia="es-CO"/>
+        </w:rPr>
+        <w:t xml:space="preserve"> </w:t>
+      </w:r>
+      <w:proofErr w:type="spellStart"/>
+      <w:r>
+        <w:rPr>
+          <w:rFonts w:cstheme="minorHAnsi"/>
+          <w:sz w:val="24"/>
+          <w:szCs w:val="24"/>
+          <w:lang w:eastAsia="es-CO"/>
+        </w:rPr>
+        <w:t>eficientes</w:t>
+      </w:r>
+      <w:proofErr w:type="spellEnd"/>
+      <w:r>
+        <w:rPr>
+          <w:rFonts w:cstheme="minorHAnsi"/>
+          <w:sz w:val="24"/>
+          <w:szCs w:val="24"/>
+          <w:lang w:eastAsia="es-CO"/>
+        </w:rPr>
+        <w:t xml:space="preserve">, </w:t>
+      </w:r>
+      <w:proofErr w:type="spellStart"/>
+      <w:r>
+        <w:rPr>
+          <w:rFonts w:cstheme="minorHAnsi"/>
+          <w:sz w:val="24"/>
+          <w:szCs w:val="24"/>
+          <w:lang w:eastAsia="es-CO"/>
+        </w:rPr>
+        <w:t>organizadas</w:t>
+      </w:r>
+      <w:proofErr w:type="spellEnd"/>
+      <w:r>
+        <w:rPr>
+          <w:rFonts w:cstheme="minorHAnsi"/>
+          <w:sz w:val="24"/>
+          <w:szCs w:val="24"/>
+          <w:lang w:eastAsia="es-CO"/>
+        </w:rPr>
+        <w:t xml:space="preserve"> y </w:t>
+      </w:r>
+      <w:proofErr w:type="spellStart"/>
+      <w:r>
+        <w:rPr>
+          <w:rFonts w:cstheme="minorHAnsi"/>
+          <w:sz w:val="24"/>
+          <w:szCs w:val="24"/>
+          <w:lang w:eastAsia="es-CO"/>
+        </w:rPr>
+        <w:t>capaces</w:t>
+      </w:r>
+      <w:proofErr w:type="spellEnd"/>
+      <w:r>
+        <w:rPr>
+          <w:rFonts w:cstheme="minorHAnsi"/>
+          <w:sz w:val="24"/>
+          <w:szCs w:val="24"/>
+          <w:lang w:eastAsia="es-CO"/>
+        </w:rPr>
+        <w:t xml:space="preserve"> de </w:t>
+      </w:r>
+      <w:proofErr w:type="spellStart"/>
+      <w:r>
+        <w:rPr>
+          <w:rFonts w:cstheme="minorHAnsi"/>
+          <w:sz w:val="24"/>
+          <w:szCs w:val="24"/>
+          <w:lang w:eastAsia="es-CO"/>
+        </w:rPr>
+        <w:t>manejar</w:t>
+      </w:r>
+      <w:proofErr w:type="spellEnd"/>
+      <w:r>
+        <w:rPr>
+          <w:rFonts w:cstheme="minorHAnsi"/>
+          <w:sz w:val="24"/>
+          <w:szCs w:val="24"/>
+          <w:lang w:eastAsia="es-CO"/>
+        </w:rPr>
+        <w:t xml:space="preserve"> </w:t>
+      </w:r>
+      <w:proofErr w:type="spellStart"/>
+      <w:r>
+        <w:rPr>
+          <w:rFonts w:cstheme="minorHAnsi"/>
+          <w:sz w:val="24"/>
+          <w:szCs w:val="24"/>
+          <w:lang w:eastAsia="es-CO"/>
+        </w:rPr>
+        <w:t>fallos</w:t>
+      </w:r>
+      <w:proofErr w:type="spellEnd"/>
+      <w:r>
+        <w:rPr>
+          <w:rFonts w:cstheme="minorHAnsi"/>
+          <w:sz w:val="24"/>
+          <w:szCs w:val="24"/>
+          <w:lang w:eastAsia="es-CO"/>
+        </w:rPr>
+        <w:t xml:space="preserve"> sin </w:t>
+      </w:r>
+      <w:proofErr w:type="spellStart"/>
+      <w:r>
+        <w:rPr>
+          <w:rFonts w:cstheme="minorHAnsi"/>
+          <w:sz w:val="24"/>
+          <w:szCs w:val="24"/>
+          <w:lang w:eastAsia="es-CO"/>
+        </w:rPr>
+        <w:t>interrumpir</w:t>
+      </w:r>
+      <w:proofErr w:type="spellEnd"/>
+      <w:r>
+        <w:rPr>
+          <w:rFonts w:cstheme="minorHAnsi"/>
+          <w:sz w:val="24"/>
+          <w:szCs w:val="24"/>
+          <w:lang w:eastAsia="es-CO"/>
+        </w:rPr>
+        <w:t xml:space="preserve"> </w:t>
+      </w:r>
+      <w:proofErr w:type="spellStart"/>
+      <w:r>
+        <w:rPr>
+          <w:rFonts w:cstheme="minorHAnsi"/>
+          <w:sz w:val="24"/>
+          <w:szCs w:val="24"/>
+          <w:lang w:eastAsia="es-CO"/>
+        </w:rPr>
+        <w:t>su</w:t>
+      </w:r>
+      <w:proofErr w:type="spellEnd"/>
+      <w:r>
+        <w:rPr>
+          <w:rFonts w:cstheme="minorHAnsi"/>
+          <w:sz w:val="24"/>
+          <w:szCs w:val="24"/>
+          <w:lang w:eastAsia="es-CO"/>
+        </w:rPr>
+        <w:t xml:space="preserve"> </w:t>
+      </w:r>
+      <w:proofErr w:type="spellStart"/>
+      <w:r>
+        <w:rPr>
+          <w:rFonts w:cstheme="minorHAnsi"/>
+          <w:sz w:val="24"/>
+          <w:szCs w:val="24"/>
+          <w:lang w:eastAsia="es-CO"/>
+        </w:rPr>
+        <w:t>funcionamiento</w:t>
+      </w:r>
+      <w:proofErr w:type="spellEnd"/>
+      <w:r>
+        <w:rPr>
+          <w:rFonts w:cstheme="minorHAnsi"/>
+          <w:sz w:val="24"/>
+          <w:szCs w:val="24"/>
+          <w:lang w:eastAsia="es-CO"/>
+        </w:rPr>
+        <w:t>.</w:t>
       </w:r>
     </w:p>
     <w:p>
@@ -951,36 +2623,63 @@
           <w:bCs/>
         </w:rPr>
       </w:pPr>
+      <w:proofErr w:type="spellStart"/>
       <w:r>
         <w:rPr>
           <w:b/>
           <w:bCs/>
         </w:rPr>
-        <w:t>Objetivo general</w:t>
-      </w:r>
-    </w:p>
-    <w:p>
-      <w:pPr>
-        <w:pStyle w:val="NormalWeb"/>
-      </w:pPr>
-      <w:r>
-        <w:t>Implementar un sistema orientado a objetos en Python que permita gestionar clientes, servicios y reservas, incorporando manejo avanzado de excepciones para garantizar la estabilidad y robustez de la aplicación.</w:t>
-      </w:r>
-    </w:p>
-    <w:p>
-      <w:pPr>
+        <w:t>Objetivo</w:t>
+      </w:r>
+      <w:proofErr w:type="spellEnd"/>
+      <w:r>
         <w:rPr>
           <w:b/>
           <w:bCs/>
         </w:rPr>
-      </w:pPr>
-      <w:r>
+        <w:t xml:space="preserve"> general</w:t>
+      </w:r>
+    </w:p>
+    <w:p>
+      <w:pPr>
+        <w:pStyle w:val="NormalWeb"/>
+      </w:pPr>
+      <w:r>
+        <w:t>Implementar un sistema orientado a objetos en Python que permita gestionar clientes, servicios y reservas, incorporando manejo avanzado de excepciones para garantizar la estabilidad y robustez de la aplicación.</w:t>
+      </w:r>
+    </w:p>
+    <w:p>
+      <w:pPr>
         <w:rPr>
           <w:b/>
           <w:bCs/>
         </w:rPr>
-        <w:t>Objetivos específicos</w:t>
-      </w:r>
+      </w:pPr>
+      <w:proofErr w:type="spellStart"/>
+      <w:r>
+        <w:rPr>
+          <w:b/>
+          <w:bCs/>
+        </w:rPr>
+        <w:t>Objetivos</w:t>
+      </w:r>
+      <w:proofErr w:type="spellEnd"/>
+      <w:r>
+        <w:rPr>
+          <w:b/>
+          <w:bCs/>
+        </w:rPr>
+        <w:t xml:space="preserve"> </w:t>
+      </w:r>
+      <w:proofErr w:type="spellStart"/>
+      <w:r>
+        <w:rPr>
+          <w:b/>
+          <w:bCs/>
+        </w:rPr>
+        <w:t>específicos</w:t>
+      </w:r>
+      <w:proofErr w:type="spellEnd"/>
     </w:p>
     <w:p>
       <w:pPr>
@@ -993,8 +2692,117 @@
         <w:autoSpaceDN/>
         <w:spacing w:before="100" w:beforeAutospacing="1" w:after="100" w:afterAutospacing="1"/>
       </w:pPr>
-      <w:r>
-        <w:t xml:space="preserve">Diseñar la estructura del sistema utilizando principios de programación orientada a objetos como abstracción, encapsulación, herencia y polimorfismo. </w:t>
+      <w:proofErr w:type="spellStart"/>
+      <w:r>
+        <w:t>Diseñar</w:t>
+      </w:r>
+      <w:proofErr w:type="spellEnd"/>
+      <w:r>
+        <w:t xml:space="preserve"> la </w:t>
+      </w:r>
+      <w:proofErr w:type="spellStart"/>
+      <w:r>
+        <w:t>estructura</w:t>
+      </w:r>
+      <w:proofErr w:type="spellEnd"/>
+      <w:r>
+        <w:t xml:space="preserve"> del </w:t>
+      </w:r>
+      <w:proofErr w:type="spellStart"/>
+      <w:r>
+        <w:t>sistema</w:t>
+      </w:r>
+      <w:proofErr w:type="spellEnd"/>
+      <w:r>
+        <w:t xml:space="preserve"> </w:t>
+      </w:r>
+      <w:proofErr w:type="spellStart"/>
+      <w:r>
+        <w:t>utilizando</w:t>
+      </w:r>
+      <w:proofErr w:type="spellEnd"/>
+      <w:r>
+        <w:t xml:space="preserve"> </w:t>
+      </w:r>
+      <w:proofErr w:type="spellStart"/>
+      <w:r>
+        <w:t>principios</w:t>
+      </w:r>
+      <w:proofErr w:type="spellEnd"/>
+      <w:r>
+        <w:t xml:space="preserve"> de </w:t>
+      </w:r>
+      <w:proofErr w:type="spellStart"/>
+      <w:r>
+        <w:t>programación</w:t>
+      </w:r>
+      <w:proofErr w:type="spellEnd"/>
+      <w:r>
+        <w:t xml:space="preserve"> </w:t>
+      </w:r>
+      <w:proofErr w:type="spellStart"/>
+      <w:r>
+        <w:t>orientada</w:t>
+      </w:r>
+      <w:proofErr w:type="spellEnd"/>
+      <w:r>
+        <w:t xml:space="preserve"> </w:t>
+      </w:r>
+      <w:proofErr w:type="gramStart"/>
+      <w:r>
+        <w:t>a</w:t>
+      </w:r>
+      <w:proofErr w:type="gramEnd"/>
+      <w:r>
+        <w:t xml:space="preserve"> </w:t>
+      </w:r>
+      <w:proofErr w:type="spellStart"/>
+      <w:r>
+        <w:t>objetos</w:t>
+      </w:r>
+      <w:proofErr w:type="spellEnd"/>
+      <w:r>
+        <w:t xml:space="preserve"> </w:t>
+      </w:r>
+      <w:proofErr w:type="spellStart"/>
+      <w:r>
+        <w:t>como</w:t>
+      </w:r>
+      <w:proofErr w:type="spellEnd"/>
+      <w:r>
+        <w:t xml:space="preserve"> </w:t>
+      </w:r>
+      <w:proofErr w:type="spellStart"/>
+      <w:r>
+        <w:t>abstracción</w:t>
+      </w:r>
+      <w:proofErr w:type="spellEnd"/>
+      <w:r>
+        <w:t xml:space="preserve">, </w:t>
+      </w:r>
+      <w:proofErr w:type="spellStart"/>
+      <w:r>
+        <w:t>encapsulación</w:t>
+      </w:r>
+      <w:proofErr w:type="spellEnd"/>
+      <w:r>
+        <w:t xml:space="preserve">, </w:t>
+      </w:r>
+      <w:proofErr w:type="spellStart"/>
+      <w:r>
+        <w:t>herencia</w:t>
+      </w:r>
+      <w:proofErr w:type="spellEnd"/>
+      <w:r>
+        <w:t xml:space="preserve"> y </w:t>
+      </w:r>
+      <w:proofErr w:type="spellStart"/>
+      <w:r>
+        <w:t>polimorfismo</w:t>
+      </w:r>
+      <w:proofErr w:type="spellEnd"/>
+      <w:r>
+        <w:t xml:space="preserve">. </w:t>
       </w:r>
     </w:p>
     <w:p>
@@ -1008,8 +2816,101 @@
         <w:autoSpaceDN/>
         <w:spacing w:before="100" w:beforeAutospacing="1" w:after="100" w:afterAutospacing="1"/>
       </w:pPr>
-      <w:r>
-        <w:t xml:space="preserve">Desarrollar clases para la gestión de clientes, servicios y reservas, asegurando una correcta organización y modularidad del código. </w:t>
+      <w:proofErr w:type="spellStart"/>
+      <w:r>
+        <w:t>Desarrollar</w:t>
+      </w:r>
+      <w:proofErr w:type="spellEnd"/>
+      <w:r>
+        <w:t xml:space="preserve"> </w:t>
+      </w:r>
+      <w:proofErr w:type="spellStart"/>
+      <w:r>
+        <w:t>clases</w:t>
+      </w:r>
+      <w:proofErr w:type="spellEnd"/>
+      <w:r>
+        <w:t xml:space="preserve"> para la </w:t>
+      </w:r>
+      <w:proofErr w:type="spellStart"/>
+      <w:r>
+        <w:t>gestión</w:t>
+      </w:r>
+      <w:proofErr w:type="spellEnd"/>
+      <w:r>
+        <w:t xml:space="preserve"> de </w:t>
+      </w:r>
+      <w:proofErr w:type="spellStart"/>
+      <w:r>
+        <w:t>clientes</w:t>
+      </w:r>
+      <w:proofErr w:type="spellEnd"/>
+      <w:r>
+        <w:t xml:space="preserve">, </w:t>
+      </w:r>
+      <w:proofErr w:type="spellStart"/>
+      <w:r>
+        <w:t>servicios</w:t>
+      </w:r>
+      <w:proofErr w:type="spellEnd"/>
+      <w:r>
+        <w:t xml:space="preserve"> y </w:t>
+      </w:r>
+      <w:proofErr w:type="spellStart"/>
+      <w:r>
+        <w:t>reservas</w:t>
+      </w:r>
+      <w:proofErr w:type="spellEnd"/>
+      <w:r>
+        <w:t xml:space="preserve">, </w:t>
+      </w:r>
+      <w:proofErr w:type="spellStart"/>
+      <w:r>
+        <w:t>asegurando</w:t>
+      </w:r>
+      <w:proofErr w:type="spellEnd"/>
+      <w:r>
+        <w:t xml:space="preserve"> </w:t>
+      </w:r>
+      <w:proofErr w:type="spellStart"/>
+      <w:r>
+        <w:t>una</w:t>
+      </w:r>
+      <w:proofErr w:type="spellEnd"/>
+      <w:r>
+        <w:t xml:space="preserve"> </w:t>
+      </w:r>
+      <w:proofErr w:type="spellStart"/>
+      <w:r>
+        <w:t>correcta</w:t>
+      </w:r>
+      <w:proofErr w:type="spellEnd"/>
+      <w:r>
+        <w:t xml:space="preserve"> </w:t>
+      </w:r>
+      <w:proofErr w:type="spellStart"/>
+      <w:r>
+        <w:t>organización</w:t>
+      </w:r>
+      <w:proofErr w:type="spellEnd"/>
+      <w:r>
+        <w:t xml:space="preserve"> y </w:t>
+      </w:r>
+      <w:proofErr w:type="spellStart"/>
+      <w:r>
+        <w:t>modularidad</w:t>
+      </w:r>
+      <w:proofErr w:type="spellEnd"/>
+      <w:r>
+        <w:t xml:space="preserve"> del </w:t>
+      </w:r>
+      <w:proofErr w:type="spellStart"/>
+      <w:r>
+        <w:t>código</w:t>
+      </w:r>
+      <w:proofErr w:type="spellEnd"/>
+      <w:r>
+        <w:t xml:space="preserve">. </w:t>
       </w:r>
     </w:p>
     <w:p>
@@ -1023,8 +2924,101 @@
         <w:autoSpaceDN/>
         <w:spacing w:before="100" w:beforeAutospacing="1" w:after="100" w:afterAutospacing="1"/>
       </w:pPr>
-      <w:r>
-        <w:t xml:space="preserve">Implementar mecanismos de validación de datos que permitan detectar errores en entradas inválidas durante la ejecución del programa. </w:t>
+      <w:proofErr w:type="spellStart"/>
+      <w:r>
+        <w:t>Implementar</w:t>
+      </w:r>
+      <w:proofErr w:type="spellEnd"/>
+      <w:r>
+        <w:t xml:space="preserve"> </w:t>
+      </w:r>
+      <w:proofErr w:type="spellStart"/>
+      <w:r>
+        <w:t>mecanismos</w:t>
+      </w:r>
+      <w:proofErr w:type="spellEnd"/>
+      <w:r>
+        <w:t xml:space="preserve"> de </w:t>
+      </w:r>
+      <w:proofErr w:type="spellStart"/>
+      <w:r>
+        <w:t>validación</w:t>
+      </w:r>
+      <w:proofErr w:type="spellEnd"/>
+      <w:r>
+        <w:t xml:space="preserve"> de </w:t>
+      </w:r>
+      <w:proofErr w:type="spellStart"/>
+      <w:r>
+        <w:t>datos</w:t>
+      </w:r>
+      <w:proofErr w:type="spellEnd"/>
+      <w:r>
+        <w:t xml:space="preserve"> que </w:t>
+      </w:r>
+      <w:proofErr w:type="spellStart"/>
+      <w:r>
+        <w:t>permitan</w:t>
+      </w:r>
+      <w:proofErr w:type="spellEnd"/>
+      <w:r>
+        <w:t xml:space="preserve"> </w:t>
+      </w:r>
+      <w:proofErr w:type="spellStart"/>
+      <w:r>
+        <w:t>detectar</w:t>
+      </w:r>
+      <w:proofErr w:type="spellEnd"/>
+      <w:r>
+        <w:t xml:space="preserve"> </w:t>
+      </w:r>
+      <w:proofErr w:type="spellStart"/>
+      <w:r>
+        <w:t>errores</w:t>
+      </w:r>
+      <w:proofErr w:type="spellEnd"/>
+      <w:r>
+        <w:t xml:space="preserve"> </w:t>
+      </w:r>
+      <w:proofErr w:type="spellStart"/>
+      <w:r>
+        <w:t>en</w:t>
+      </w:r>
+      <w:proofErr w:type="spellEnd"/>
+      <w:r>
+        <w:t xml:space="preserve"> entradas </w:t>
+      </w:r>
+      <w:proofErr w:type="spellStart"/>
+      <w:r>
+        <w:t>inválidas</w:t>
+      </w:r>
+      <w:proofErr w:type="spellEnd"/>
+      <w:r>
+        <w:t xml:space="preserve"> </w:t>
+      </w:r>
+      <w:proofErr w:type="spellStart"/>
+      <w:r>
+        <w:t>durante</w:t>
+      </w:r>
+      <w:proofErr w:type="spellEnd"/>
+      <w:r>
+        <w:t xml:space="preserve"> la </w:t>
+      </w:r>
+      <w:proofErr w:type="spellStart"/>
+      <w:r>
+        <w:t>ejecución</w:t>
+      </w:r>
+      <w:proofErr w:type="spellEnd"/>
+      <w:r>
+        <w:t xml:space="preserve"> del </w:t>
+      </w:r>
+      <w:proofErr w:type="spellStart"/>
+      <w:r>
+        <w:t>programa</w:t>
+      </w:r>
+      <w:proofErr w:type="spellEnd"/>
+      <w:r>
+        <w:t xml:space="preserve">. </w:t>
       </w:r>
     </w:p>
     <w:p>
@@ -1038,8 +3032,53 @@
         <w:autoSpaceDN/>
         <w:spacing w:before="100" w:beforeAutospacing="1" w:after="100" w:afterAutospacing="1"/>
       </w:pPr>
-      <w:r>
-        <w:t xml:space="preserve">Aplicar el manejo de excepciones mediante estructuras </w:t>
+      <w:proofErr w:type="spellStart"/>
+      <w:r>
+        <w:t>Aplicar</w:t>
+      </w:r>
+      <w:proofErr w:type="spellEnd"/>
+      <w:r>
+        <w:t xml:space="preserve"> </w:t>
+      </w:r>
+      <w:proofErr w:type="spellStart"/>
+      <w:r>
+        <w:t>el</w:t>
+      </w:r>
+      <w:proofErr w:type="spellEnd"/>
+      <w:r>
+        <w:t xml:space="preserve"> </w:t>
+      </w:r>
+      <w:proofErr w:type="spellStart"/>
+      <w:r>
+        <w:t>manejo</w:t>
+      </w:r>
+      <w:proofErr w:type="spellEnd"/>
+      <w:r>
+        <w:t xml:space="preserve"> de </w:t>
+      </w:r>
+      <w:proofErr w:type="spellStart"/>
+      <w:r>
+        <w:t>excepciones</w:t>
+      </w:r>
+      <w:proofErr w:type="spellEnd"/>
+      <w:r>
+        <w:t xml:space="preserve"> </w:t>
+      </w:r>
+      <w:proofErr w:type="spellStart"/>
+      <w:r>
+        <w:t>mediante</w:t>
+      </w:r>
+      <w:proofErr w:type="spellEnd"/>
+      <w:r>
+        <w:t xml:space="preserve"> </w:t>
+      </w:r>
+      <w:proofErr w:type="spellStart"/>
+      <w:r>
+        <w:t>estructuras</w:t>
+      </w:r>
+      <w:proofErr w:type="spellEnd"/>
+      <w:r>
+        <w:t xml:space="preserve"> </w:t>
       </w:r>
       <w:r>
         <w:rPr>
@@ -1075,7 +3114,55 @@
         <w:t>finally</w:t>
       </w:r>
       <w:r>
-        <w:t xml:space="preserve">, así como el uso de excepciones personalizadas. </w:t>
+        <w:t xml:space="preserve">, </w:t>
+      </w:r>
+      <w:proofErr w:type="spellStart"/>
+      <w:r>
+        <w:t>así</w:t>
+      </w:r>
+      <w:proofErr w:type="spellEnd"/>
+      <w:r>
+        <w:t xml:space="preserve"> </w:t>
+      </w:r>
+      <w:proofErr w:type="spellStart"/>
+      <w:r>
+        <w:t>como</w:t>
+      </w:r>
+      <w:proofErr w:type="spellEnd"/>
+      <w:r>
+        <w:t xml:space="preserve"> </w:t>
+      </w:r>
+      <w:proofErr w:type="spellStart"/>
+      <w:r>
+        <w:t>el</w:t>
+      </w:r>
+      <w:proofErr w:type="spellEnd"/>
+      <w:r>
+        <w:t xml:space="preserve"> </w:t>
+      </w:r>
+      <w:proofErr w:type="spellStart"/>
+      <w:r>
+        <w:t>uso</w:t>
+      </w:r>
+      <w:proofErr w:type="spellEnd"/>
+      <w:r>
+        <w:t xml:space="preserve"> de </w:t>
+      </w:r>
+      <w:proofErr w:type="spellStart"/>
+      <w:r>
+        <w:t>excepciones</w:t>
+      </w:r>
+      <w:proofErr w:type="spellEnd"/>
+      <w:r>
+        <w:t xml:space="preserve"> </w:t>
+      </w:r>
+      <w:proofErr w:type="spellStart"/>
+      <w:r>
+        <w:t>personalizadas</w:t>
+      </w:r>
+      <w:proofErr w:type="spellEnd"/>
+      <w:r>
+        <w:t xml:space="preserve">. </w:t>
       </w:r>
     </w:p>
     <w:p>
@@ -1090,7 +3177,87 @@
         <w:spacing w:before="100" w:beforeAutospacing="1" w:after="100" w:afterAutospacing="1"/>
       </w:pPr>
       <w:r>
-        <w:t xml:space="preserve">Registrar los errores y eventos relevantes en un archivo de log para garantizar el seguimiento y control del sistema. </w:t>
+        <w:t xml:space="preserve">Registrar </w:t>
+      </w:r>
+      <w:proofErr w:type="spellStart"/>
+      <w:r>
+        <w:t>los</w:t>
+      </w:r>
+      <w:proofErr w:type="spellEnd"/>
+      <w:r>
+        <w:t xml:space="preserve"> </w:t>
+      </w:r>
+      <w:proofErr w:type="spellStart"/>
+      <w:r>
+        <w:t>errores</w:t>
+      </w:r>
+      <w:proofErr w:type="spellEnd"/>
+      <w:r>
+        <w:t xml:space="preserve"> y </w:t>
+      </w:r>
+      <w:proofErr w:type="spellStart"/>
+      <w:r>
+        <w:t>eventos</w:t>
+      </w:r>
+      <w:proofErr w:type="spellEnd"/>
+      <w:r>
+        <w:t xml:space="preserve"> </w:t>
+      </w:r>
+      <w:proofErr w:type="spellStart"/>
+      <w:r>
+        <w:t>relevantes</w:t>
+      </w:r>
+      <w:proofErr w:type="spellEnd"/>
+      <w:r>
+        <w:t xml:space="preserve"> </w:t>
+      </w:r>
+      <w:proofErr w:type="spellStart"/>
+      <w:r>
+        <w:t>en</w:t>
+      </w:r>
+      <w:proofErr w:type="spellEnd"/>
+      <w:r>
+        <w:t xml:space="preserve"> un </w:t>
+      </w:r>
+      <w:proofErr w:type="spellStart"/>
+      <w:r>
+        <w:t>archivo</w:t>
+      </w:r>
+      <w:proofErr w:type="spellEnd"/>
+      <w:r>
+        <w:t xml:space="preserve"> de log para </w:t>
+      </w:r>
+      <w:proofErr w:type="spellStart"/>
+      <w:r>
+        <w:t>garantizar</w:t>
+      </w:r>
+      <w:proofErr w:type="spellEnd"/>
+      <w:r>
+        <w:t xml:space="preserve"> </w:t>
+      </w:r>
+      <w:proofErr w:type="spellStart"/>
+      <w:r>
+        <w:t>el</w:t>
+      </w:r>
+      <w:proofErr w:type="spellEnd"/>
+      <w:r>
+        <w:t xml:space="preserve"> </w:t>
+      </w:r>
+      <w:proofErr w:type="spellStart"/>
+      <w:r>
+        <w:t>seguimiento</w:t>
+      </w:r>
+      <w:proofErr w:type="spellEnd"/>
+      <w:r>
+        <w:t xml:space="preserve"> y control del </w:t>
+      </w:r>
+      <w:proofErr w:type="spellStart"/>
+      <w:r>
+        <w:t>sistema</w:t>
+      </w:r>
+      <w:proofErr w:type="spellEnd"/>
+      <w:r>
+        <w:t xml:space="preserve">. </w:t>
       </w:r>
     </w:p>
     <w:p>
@@ -1104,8 +3271,109 @@
         <w:autoSpaceDN/>
         <w:spacing w:before="100" w:beforeAutospacing="1" w:after="100" w:afterAutospacing="1"/>
       </w:pPr>
-      <w:r>
-        <w:t xml:space="preserve">Ejecutar pruebas mediante la simulación de múltiples operaciones, incluyendo casos válidos e inválidos, para verificar la estabilidad del sistema. </w:t>
+      <w:proofErr w:type="spellStart"/>
+      <w:r>
+        <w:t>Ejecutar</w:t>
+      </w:r>
+      <w:proofErr w:type="spellEnd"/>
+      <w:r>
+        <w:t xml:space="preserve"> </w:t>
+      </w:r>
+      <w:proofErr w:type="spellStart"/>
+      <w:r>
+        <w:t>pruebas</w:t>
+      </w:r>
+      <w:proofErr w:type="spellEnd"/>
+      <w:r>
+        <w:t xml:space="preserve"> </w:t>
+      </w:r>
+      <w:proofErr w:type="spellStart"/>
+      <w:r>
+        <w:t>mediante</w:t>
+      </w:r>
+      <w:proofErr w:type="spellEnd"/>
+      <w:r>
+        <w:t xml:space="preserve"> la </w:t>
+      </w:r>
+      <w:proofErr w:type="spellStart"/>
+      <w:r>
+        <w:t>simulación</w:t>
+      </w:r>
+      <w:proofErr w:type="spellEnd"/>
+      <w:r>
+        <w:t xml:space="preserve"> de </w:t>
+      </w:r>
+      <w:proofErr w:type="spellStart"/>
+      <w:r>
+        <w:t>múltiples</w:t>
+      </w:r>
+      <w:proofErr w:type="spellEnd"/>
+      <w:r>
+        <w:t xml:space="preserve"> </w:t>
+      </w:r>
+      <w:proofErr w:type="spellStart"/>
+      <w:r>
+        <w:t>operaciones</w:t>
+      </w:r>
+      <w:proofErr w:type="spellEnd"/>
+      <w:r>
+        <w:t xml:space="preserve">, </w:t>
+      </w:r>
+      <w:proofErr w:type="spellStart"/>
+      <w:r>
+        <w:t>incluyendo</w:t>
+      </w:r>
+      <w:proofErr w:type="spellEnd"/>
+      <w:r>
+        <w:t xml:space="preserve"> </w:t>
+      </w:r>
+      <w:proofErr w:type="spellStart"/>
+      <w:r>
+        <w:t>casos</w:t>
+      </w:r>
+      <w:proofErr w:type="spellEnd"/>
+      <w:r>
+        <w:t xml:space="preserve"> </w:t>
+      </w:r>
+      <w:proofErr w:type="spellStart"/>
+      <w:r>
+        <w:t>válidos</w:t>
+      </w:r>
+      <w:proofErr w:type="spellEnd"/>
+      <w:r>
+        <w:t xml:space="preserve"> e </w:t>
+      </w:r>
+      <w:proofErr w:type="spellStart"/>
+      <w:r>
+        <w:t>inválidos</w:t>
+      </w:r>
+      <w:proofErr w:type="spellEnd"/>
+      <w:r>
+        <w:t xml:space="preserve">, para </w:t>
+      </w:r>
+      <w:proofErr w:type="spellStart"/>
+      <w:r>
+        <w:t>verificar</w:t>
+      </w:r>
+      <w:proofErr w:type="spellEnd"/>
+      <w:r>
+        <w:t xml:space="preserve"> la </w:t>
+      </w:r>
+      <w:proofErr w:type="spellStart"/>
+      <w:r>
+        <w:t>estabilidad</w:t>
+      </w:r>
+      <w:proofErr w:type="spellEnd"/>
+      <w:r>
+        <w:t xml:space="preserve"> del </w:t>
+      </w:r>
+      <w:proofErr w:type="spellStart"/>
+      <w:r>
+        <w:t>sistema</w:t>
+      </w:r>
+      <w:proofErr w:type="spellEnd"/>
+      <w:r>
+        <w:t xml:space="preserve">. </w:t>
       </w:r>
     </w:p>
     <w:p>
@@ -1119,9 +3387,75 @@
         <w:autoSpaceDN/>
         <w:spacing w:before="100" w:beforeAutospacing="1" w:after="100" w:afterAutospacing="1"/>
       </w:pPr>
-      <w:r>
-        <w:t>Evaluar el funcionamiento del sistema asegurando que continúe operando correctamente ante la presencia de errores</w:t>
-      </w:r>
+      <w:proofErr w:type="spellStart"/>
+      <w:r>
+        <w:t>Evaluar</w:t>
+      </w:r>
+      <w:proofErr w:type="spellEnd"/>
+      <w:r>
+        <w:t xml:space="preserve"> </w:t>
+      </w:r>
+      <w:proofErr w:type="spellStart"/>
+      <w:r>
+        <w:t>el</w:t>
+      </w:r>
+      <w:proofErr w:type="spellEnd"/>
+      <w:r>
+        <w:t xml:space="preserve"> </w:t>
+      </w:r>
+      <w:proofErr w:type="spellStart"/>
+      <w:r>
+        <w:t>funcionamiento</w:t>
+      </w:r>
+      <w:proofErr w:type="spellEnd"/>
+      <w:r>
+        <w:t xml:space="preserve"> del </w:t>
+      </w:r>
+      <w:proofErr w:type="spellStart"/>
+      <w:r>
+        <w:t>sistema</w:t>
+      </w:r>
+      <w:proofErr w:type="spellEnd"/>
+      <w:r>
+        <w:t xml:space="preserve"> </w:t>
+      </w:r>
+      <w:proofErr w:type="spellStart"/>
+      <w:r>
+        <w:t>asegurando</w:t>
+      </w:r>
+      <w:proofErr w:type="spellEnd"/>
+      <w:r>
+        <w:t xml:space="preserve"> que </w:t>
+      </w:r>
+      <w:proofErr w:type="spellStart"/>
+      <w:r>
+        <w:t>continúe</w:t>
+      </w:r>
+      <w:proofErr w:type="spellEnd"/>
+      <w:r>
+        <w:t xml:space="preserve"> operando </w:t>
+      </w:r>
+      <w:proofErr w:type="spellStart"/>
+      <w:r>
+        <w:t>correctamente</w:t>
+      </w:r>
+      <w:proofErr w:type="spellEnd"/>
+      <w:r>
+        <w:t xml:space="preserve"> ante la </w:t>
+      </w:r>
+      <w:proofErr w:type="spellStart"/>
+      <w:r>
+        <w:t>presencia</w:t>
+      </w:r>
+      <w:proofErr w:type="spellEnd"/>
+      <w:r>
+        <w:t xml:space="preserve"> de </w:t>
+      </w:r>
+      <w:proofErr w:type="spellStart"/>
+      <w:r>
+        <w:t>errores</w:t>
+      </w:r>
+      <w:proofErr w:type="spellEnd"/>
     </w:p>
     <w:p>
       <w:pPr>
@@ -1200,12 +3534,14 @@
         </w:rPr>
       </w:pPr>
       <w:hyperlink r:id="rId8" w:history="1">
+        <w:proofErr w:type="spellStart"/>
         <w:r>
           <w:rPr>
             <w:rStyle w:val="Hipervnculo"/>
           </w:rPr>
           <w:t>Repositorio</w:t>
         </w:r>
+        <w:proofErr w:type="spellEnd"/>
       </w:hyperlink>
     </w:p>
     <w:p>
@@ -1229,17 +3565,59 @@
           <w:lang w:val="es-CO"/>
         </w:rPr>
       </w:pPr>
+      <w:r>
+        <w:rPr>
+          <w:rStyle w:val="eop"/>
+          <w:sz w:val="24"/>
+          <w:szCs w:val="24"/>
+          <w:lang w:val="es-CO"/>
+        </w:rPr>
+        <w:t xml:space="preserve">Aquí escribo para aclarar que este trabajo lo elabore yo solo debido a que ningún compañero respondió mi mensaje y ninguno se comunicó </w:t>
+      </w:r>
+      <w:proofErr w:type="gramStart"/>
+      <w:r>
+        <w:rPr>
+          <w:rStyle w:val="eop"/>
+          <w:sz w:val="24"/>
+          <w:szCs w:val="24"/>
+          <w:lang w:val="es-CO"/>
+        </w:rPr>
+        <w:t>con migo</w:t>
+      </w:r>
+      <w:proofErr w:type="gramEnd"/>
+      <w:r>
+        <w:rPr>
+          <w:rStyle w:val="eop"/>
+          <w:sz w:val="24"/>
+          <w:szCs w:val="24"/>
+          <w:lang w:val="es-CO"/>
+        </w:rPr>
+        <w:t xml:space="preserve"> sobre este trabajo obligándome a tener que hacerlo yo solo.</w:t>
+      </w:r>
     </w:p>
     <w:p>
       <w:pPr>
         <w:spacing w:line="480" w:lineRule="auto"/>
         <w:rPr>
           <w:rStyle w:val="eop"/>
+          <w:b/>
+          <w:bCs/>
           <w:sz w:val="24"/>
           <w:szCs w:val="24"/>
           <w:lang w:val="es-CO"/>
         </w:rPr>
       </w:pPr>
+      <w:r>
+        <w:rPr>
+          <w:rStyle w:val="eop"/>
+          <w:b/>
+          <w:bCs/>
+          <w:sz w:val="24"/>
+          <w:szCs w:val="24"/>
+          <w:lang w:val="es-CO"/>
+        </w:rPr>
+        <w:t>Evidencia:</w:t>
+      </w:r>
     </w:p>
     <w:p>
       <w:pPr>
@@ -1251,6 +3629,55 @@
           <w:lang w:val="es-CO"/>
         </w:rPr>
       </w:pPr>
+      <w:r>
+        <w:rPr>
+          <w:noProof/>
+          <w:sz w:val="24"/>
+          <w:szCs w:val="24"/>
+          <w:lang w:val="es-CO"/>
+        </w:rPr>
+        <w:drawing>
+          <wp:inline distT="0" distB="0" distL="0" distR="0" wp14:anchorId="7922884F" wp14:editId="6274A247">
+            <wp:extent cx="5734050" cy="2715895"/>
+            <wp:effectExtent l="0" t="0" r="0" b="8255"/>
+            <wp:docPr id="1" name="Imagen 1"/>
+            <wp:cNvGraphicFramePr>
+              <a:graphicFrameLocks xmlns:a="http://schemas.openxmlformats.org/drawingml/2006/main" noChangeAspect="1"/>
+            </wp:cNvGraphicFramePr>
+            <a:graphic xmlns:a="http://schemas.openxmlformats.org/drawingml/2006/main">
+              <a:graphicData uri="http://schemas.openxmlformats.org/drawingml/2006/picture">
+                <pic:pic xmlns:pic="http://schemas.openxmlformats.org/drawingml/2006/picture">
+                  <pic:nvPicPr>
+                    <pic:cNvPr id="1" name="Imagen 1"/>
+                    <pic:cNvPicPr/>
+                  </pic:nvPicPr>
+                  <pic:blipFill>
+                    <a:blip r:embed="rId9">
+                      <a:extLst>
+                        <a:ext uri="{28A0092B-C50C-407E-A947-70E740481C1C}">
+                          <a14:useLocalDpi xmlns:a14="http://schemas.microsoft.com/office/drawing/2010/main" val="0"/>
+                        </a:ext>
+                      </a:extLst>
+                    </a:blip>
+                    <a:stretch>
+                      <a:fillRect/>
+                    </a:stretch>
+                  </pic:blipFill>
+                  <pic:spPr>
+                    <a:xfrm>
+                      <a:off x="0" y="0"/>
+                      <a:ext cx="5734050" cy="2715895"/>
+                    </a:xfrm>
+                    <a:prstGeom prst="rect">
+                      <a:avLst/>
+                    </a:prstGeom>
+                  </pic:spPr>
+                </pic:pic>
+              </a:graphicData>
+            </a:graphic>
+          </wp:inline>
+        </w:drawing>
+      </w:r>
     </w:p>
     <w:p>
       <w:pPr>
@@ -1331,7 +3758,6 @@
     </w:p>
     <w:p>
       <w:pPr>
-        <w:spacing w:line="480" w:lineRule="auto"/>
         <w:rPr>
           <w:rStyle w:val="eop"/>
           <w:sz w:val="24"/>
@@ -1342,7 +3768,6 @@
     </w:p>
     <w:p>
       <w:pPr>
-        <w:spacing w:line="480" w:lineRule="auto"/>
         <w:rPr>
           <w:rStyle w:val="eop"/>
           <w:sz w:val="24"/>
@@ -1353,123 +3778,6 @@
     </w:p>
     <w:p>
       <w:pPr>
-        <w:spacing w:line="480" w:lineRule="auto"/>
-        <w:rPr>
-          <w:rStyle w:val="eop"/>
-          <w:sz w:val="24"/>
-          <w:szCs w:val="24"/>
-          <w:lang w:val="es-CO"/>
-        </w:rPr>
-      </w:pPr>
-    </w:p>
-    <w:p>
-      <w:pPr>
-        <w:spacing w:line="480" w:lineRule="auto"/>
-        <w:rPr>
-          <w:rStyle w:val="eop"/>
-          <w:sz w:val="24"/>
-          <w:szCs w:val="24"/>
-          <w:lang w:val="es-CO"/>
-        </w:rPr>
-      </w:pPr>
-    </w:p>
-    <w:p>
-      <w:pPr>
-        <w:spacing w:line="480" w:lineRule="auto"/>
-        <w:rPr>
-          <w:rStyle w:val="eop"/>
-          <w:sz w:val="24"/>
-          <w:szCs w:val="24"/>
-          <w:lang w:val="es-CO"/>
-        </w:rPr>
-      </w:pPr>
-    </w:p>
-    <w:p>
-      <w:pPr>
-        <w:spacing w:line="480" w:lineRule="auto"/>
-        <w:rPr>
-          <w:rStyle w:val="eop"/>
-          <w:sz w:val="24"/>
-          <w:szCs w:val="24"/>
-          <w:lang w:val="es-CO"/>
-        </w:rPr>
-      </w:pPr>
-    </w:p>
-    <w:p>
-      <w:pPr>
-        <w:jc w:val="center"/>
-        <w:rPr>
-          <w:lang w:val="es-CO"/>
-        </w:rPr>
-      </w:pPr>
-    </w:p>
-    <w:p>
-      <w:pPr>
-        <w:jc w:val="center"/>
-        <w:rPr>
-          <w:lang w:val="es-CO"/>
-        </w:rPr>
-      </w:pPr>
-    </w:p>
-    <w:p>
-      <w:pPr>
-        <w:jc w:val="center"/>
-        <w:rPr>
-          <w:lang w:val="es-CO"/>
-        </w:rPr>
-      </w:pPr>
-    </w:p>
-    <w:p>
-      <w:pPr>
-        <w:jc w:val="center"/>
-        <w:rPr>
-          <w:lang w:val="es-CO"/>
-        </w:rPr>
-      </w:pPr>
-    </w:p>
-    <w:p>
-      <w:pPr>
-        <w:jc w:val="center"/>
-        <w:rPr>
-          <w:lang w:val="es-CO"/>
-        </w:rPr>
-      </w:pPr>
-    </w:p>
-    <w:p>
-      <w:pPr>
-        <w:jc w:val="center"/>
-        <w:rPr>
-          <w:lang w:val="es-CO"/>
-        </w:rPr>
-      </w:pPr>
-    </w:p>
-    <w:p>
-      <w:pPr>
-        <w:jc w:val="center"/>
-        <w:rPr>
-          <w:lang w:val="es-CO"/>
-        </w:rPr>
-      </w:pPr>
-    </w:p>
-    <w:p>
-      <w:pPr>
-        <w:jc w:val="center"/>
-        <w:rPr>
-          <w:lang w:val="es-CO"/>
-        </w:rPr>
-      </w:pPr>
-    </w:p>
-    <w:p>
-      <w:pPr>
-        <w:jc w:val="center"/>
-        <w:rPr>
-          <w:lang w:val="es-CO"/>
-        </w:rPr>
-      </w:pPr>
-    </w:p>
-    <w:p>
-      <w:pPr>
-        <w:jc w:val="center"/>
         <w:rPr>
           <w:lang w:val="es-CO"/>
         </w:rPr>
@@ -1541,33 +3849,1029 @@
         <w:rPr>
           <w:rFonts w:cstheme="minorHAnsi"/>
         </w:rPr>
-        <w:t>El desarrollo de este sistema permitió aplicar de manera práctica los conceptos de programación orientada a objetos, logrando una estructura organizada y modular. La implementación de clases abstractas, herencia y polimorfismo facilitó la reutilización de código y la extensibilidad del sistema.</w:t>
-      </w:r>
-    </w:p>
-    <w:p>
-      <w:pPr>
-        <w:rPr>
-          <w:rFonts w:cstheme="minorHAnsi"/>
-        </w:rPr>
-      </w:pPr>
-      <w:r>
-        <w:rPr>
-          <w:rFonts w:cstheme="minorHAnsi"/>
-        </w:rPr>
-        <w:t>Asimismo, el manejo de excepciones resultó fundamental para garantizar la estabilidad de la aplicación, permitiendo controlar errores sin interrumpir su ejecución. El uso de excepciones personalizadas y registros en archivos de log contribuyó a una mejor gestión de fallos.</w:t>
-      </w:r>
-    </w:p>
-    <w:p>
-      <w:pPr>
-        <w:rPr>
-          <w:rFonts w:cstheme="minorHAnsi"/>
-        </w:rPr>
-      </w:pPr>
-      <w:r>
-        <w:rPr>
-          <w:rFonts w:cstheme="minorHAnsi"/>
-        </w:rPr>
-        <w:t>Finalmente, se evidencia que es posible construir soluciones robustas sin el uso de bases de datos, utilizando estructuras en memoria y archivos, cumpliendo con los requerimientos establecidos en la actividad.</w:t>
+        <w:t xml:space="preserve">El </w:t>
+      </w:r>
+      <w:proofErr w:type="spellStart"/>
+      <w:r>
+        <w:rPr>
+          <w:rFonts w:cstheme="minorHAnsi"/>
+        </w:rPr>
+        <w:t>desarrollo</w:t>
+      </w:r>
+      <w:proofErr w:type="spellEnd"/>
+      <w:r>
+        <w:rPr>
+          <w:rFonts w:cstheme="minorHAnsi"/>
+        </w:rPr>
+        <w:t xml:space="preserve"> de </w:t>
+      </w:r>
+      <w:proofErr w:type="spellStart"/>
+      <w:r>
+        <w:rPr>
+          <w:rFonts w:cstheme="minorHAnsi"/>
+        </w:rPr>
+        <w:t>este</w:t>
+      </w:r>
+      <w:proofErr w:type="spellEnd"/>
+      <w:r>
+        <w:rPr>
+          <w:rFonts w:cstheme="minorHAnsi"/>
+        </w:rPr>
+        <w:t xml:space="preserve"> </w:t>
+      </w:r>
+      <w:proofErr w:type="spellStart"/>
+      <w:r>
+        <w:rPr>
+          <w:rFonts w:cstheme="minorHAnsi"/>
+        </w:rPr>
+        <w:t>sistema</w:t>
+      </w:r>
+      <w:proofErr w:type="spellEnd"/>
+      <w:r>
+        <w:rPr>
+          <w:rFonts w:cstheme="minorHAnsi"/>
+        </w:rPr>
+        <w:t xml:space="preserve"> </w:t>
+      </w:r>
+      <w:proofErr w:type="spellStart"/>
+      <w:r>
+        <w:rPr>
+          <w:rFonts w:cstheme="minorHAnsi"/>
+        </w:rPr>
+        <w:t>permitió</w:t>
+      </w:r>
+      <w:proofErr w:type="spellEnd"/>
+      <w:r>
+        <w:rPr>
+          <w:rFonts w:cstheme="minorHAnsi"/>
+        </w:rPr>
+        <w:t xml:space="preserve"> </w:t>
+      </w:r>
+      <w:proofErr w:type="spellStart"/>
+      <w:r>
+        <w:rPr>
+          <w:rFonts w:cstheme="minorHAnsi"/>
+        </w:rPr>
+        <w:t>aplicar</w:t>
+      </w:r>
+      <w:proofErr w:type="spellEnd"/>
+      <w:r>
+        <w:rPr>
+          <w:rFonts w:cstheme="minorHAnsi"/>
+        </w:rPr>
+        <w:t xml:space="preserve"> de </w:t>
+      </w:r>
+      <w:proofErr w:type="spellStart"/>
+      <w:r>
+        <w:rPr>
+          <w:rFonts w:cstheme="minorHAnsi"/>
+        </w:rPr>
+        <w:t>manera</w:t>
+      </w:r>
+      <w:proofErr w:type="spellEnd"/>
+      <w:r>
+        <w:rPr>
+          <w:rFonts w:cstheme="minorHAnsi"/>
+        </w:rPr>
+        <w:t xml:space="preserve"> </w:t>
+      </w:r>
+      <w:proofErr w:type="spellStart"/>
+      <w:r>
+        <w:rPr>
+          <w:rFonts w:cstheme="minorHAnsi"/>
+        </w:rPr>
+        <w:t>práctica</w:t>
+      </w:r>
+      <w:proofErr w:type="spellEnd"/>
+      <w:r>
+        <w:rPr>
+          <w:rFonts w:cstheme="minorHAnsi"/>
+        </w:rPr>
+        <w:t xml:space="preserve"> </w:t>
+      </w:r>
+      <w:proofErr w:type="spellStart"/>
+      <w:r>
+        <w:rPr>
+          <w:rFonts w:cstheme="minorHAnsi"/>
+        </w:rPr>
+        <w:t>los</w:t>
+      </w:r>
+      <w:proofErr w:type="spellEnd"/>
+      <w:r>
+        <w:rPr>
+          <w:rFonts w:cstheme="minorHAnsi"/>
+        </w:rPr>
+        <w:t xml:space="preserve"> </w:t>
+      </w:r>
+      <w:proofErr w:type="spellStart"/>
+      <w:r>
+        <w:rPr>
+          <w:rFonts w:cstheme="minorHAnsi"/>
+        </w:rPr>
+        <w:t>conceptos</w:t>
+      </w:r>
+      <w:proofErr w:type="spellEnd"/>
+      <w:r>
+        <w:rPr>
+          <w:rFonts w:cstheme="minorHAnsi"/>
+        </w:rPr>
+        <w:t xml:space="preserve"> de </w:t>
+      </w:r>
+      <w:proofErr w:type="spellStart"/>
+      <w:r>
+        <w:rPr>
+          <w:rFonts w:cstheme="minorHAnsi"/>
+        </w:rPr>
+        <w:t>programación</w:t>
+      </w:r>
+      <w:proofErr w:type="spellEnd"/>
+      <w:r>
+        <w:rPr>
+          <w:rFonts w:cstheme="minorHAnsi"/>
+        </w:rPr>
+        <w:t xml:space="preserve"> </w:t>
+      </w:r>
+      <w:proofErr w:type="spellStart"/>
+      <w:r>
+        <w:rPr>
+          <w:rFonts w:cstheme="minorHAnsi"/>
+        </w:rPr>
+        <w:t>orientada</w:t>
+      </w:r>
+      <w:proofErr w:type="spellEnd"/>
+      <w:r>
+        <w:rPr>
+          <w:rFonts w:cstheme="minorHAnsi"/>
+        </w:rPr>
+        <w:t xml:space="preserve"> </w:t>
+      </w:r>
+      <w:proofErr w:type="gramStart"/>
+      <w:r>
+        <w:rPr>
+          <w:rFonts w:cstheme="minorHAnsi"/>
+        </w:rPr>
+        <w:t>a</w:t>
+      </w:r>
+      <w:proofErr w:type="gramEnd"/>
+      <w:r>
+        <w:rPr>
+          <w:rFonts w:cstheme="minorHAnsi"/>
+        </w:rPr>
+        <w:t xml:space="preserve"> </w:t>
+      </w:r>
+      <w:proofErr w:type="spellStart"/>
+      <w:r>
+        <w:rPr>
+          <w:rFonts w:cstheme="minorHAnsi"/>
+        </w:rPr>
+        <w:t>objetos</w:t>
+      </w:r>
+      <w:proofErr w:type="spellEnd"/>
+      <w:r>
+        <w:rPr>
+          <w:rFonts w:cstheme="minorHAnsi"/>
+        </w:rPr>
+        <w:t xml:space="preserve">, </w:t>
+      </w:r>
+      <w:proofErr w:type="spellStart"/>
+      <w:r>
+        <w:rPr>
+          <w:rFonts w:cstheme="minorHAnsi"/>
+        </w:rPr>
+        <w:t>logrando</w:t>
+      </w:r>
+      <w:proofErr w:type="spellEnd"/>
+      <w:r>
+        <w:rPr>
+          <w:rFonts w:cstheme="minorHAnsi"/>
+        </w:rPr>
+        <w:t xml:space="preserve"> </w:t>
+      </w:r>
+      <w:proofErr w:type="spellStart"/>
+      <w:r>
+        <w:rPr>
+          <w:rFonts w:cstheme="minorHAnsi"/>
+        </w:rPr>
+        <w:t>una</w:t>
+      </w:r>
+      <w:proofErr w:type="spellEnd"/>
+      <w:r>
+        <w:rPr>
+          <w:rFonts w:cstheme="minorHAnsi"/>
+        </w:rPr>
+        <w:t xml:space="preserve"> </w:t>
+      </w:r>
+      <w:proofErr w:type="spellStart"/>
+      <w:r>
+        <w:rPr>
+          <w:rFonts w:cstheme="minorHAnsi"/>
+        </w:rPr>
+        <w:t>estructura</w:t>
+      </w:r>
+      <w:proofErr w:type="spellEnd"/>
+      <w:r>
+        <w:rPr>
+          <w:rFonts w:cstheme="minorHAnsi"/>
+        </w:rPr>
+        <w:t xml:space="preserve"> </w:t>
+      </w:r>
+      <w:proofErr w:type="spellStart"/>
+      <w:r>
+        <w:rPr>
+          <w:rFonts w:cstheme="minorHAnsi"/>
+        </w:rPr>
+        <w:t>organizada</w:t>
+      </w:r>
+      <w:proofErr w:type="spellEnd"/>
+      <w:r>
+        <w:rPr>
+          <w:rFonts w:cstheme="minorHAnsi"/>
+        </w:rPr>
+        <w:t xml:space="preserve"> y modular. La </w:t>
+      </w:r>
+      <w:proofErr w:type="spellStart"/>
+      <w:r>
+        <w:rPr>
+          <w:rFonts w:cstheme="minorHAnsi"/>
+        </w:rPr>
+        <w:t>implementación</w:t>
+      </w:r>
+      <w:proofErr w:type="spellEnd"/>
+      <w:r>
+        <w:rPr>
+          <w:rFonts w:cstheme="minorHAnsi"/>
+        </w:rPr>
+        <w:t xml:space="preserve"> de </w:t>
+      </w:r>
+      <w:proofErr w:type="spellStart"/>
+      <w:r>
+        <w:rPr>
+          <w:rFonts w:cstheme="minorHAnsi"/>
+        </w:rPr>
+        <w:t>clases</w:t>
+      </w:r>
+      <w:proofErr w:type="spellEnd"/>
+      <w:r>
+        <w:rPr>
+          <w:rFonts w:cstheme="minorHAnsi"/>
+        </w:rPr>
+        <w:t xml:space="preserve"> </w:t>
+      </w:r>
+      <w:proofErr w:type="spellStart"/>
+      <w:r>
+        <w:rPr>
+          <w:rFonts w:cstheme="minorHAnsi"/>
+        </w:rPr>
+        <w:t>abstractas</w:t>
+      </w:r>
+      <w:proofErr w:type="spellEnd"/>
+      <w:r>
+        <w:rPr>
+          <w:rFonts w:cstheme="minorHAnsi"/>
+        </w:rPr>
+        <w:t xml:space="preserve">, </w:t>
+      </w:r>
+      <w:proofErr w:type="spellStart"/>
+      <w:r>
+        <w:rPr>
+          <w:rFonts w:cstheme="minorHAnsi"/>
+        </w:rPr>
+        <w:t>herencia</w:t>
+      </w:r>
+      <w:proofErr w:type="spellEnd"/>
+      <w:r>
+        <w:rPr>
+          <w:rFonts w:cstheme="minorHAnsi"/>
+        </w:rPr>
+        <w:t xml:space="preserve"> y </w:t>
+      </w:r>
+      <w:proofErr w:type="spellStart"/>
+      <w:r>
+        <w:rPr>
+          <w:rFonts w:cstheme="minorHAnsi"/>
+        </w:rPr>
+        <w:t>polimorfismo</w:t>
+      </w:r>
+      <w:proofErr w:type="spellEnd"/>
+      <w:r>
+        <w:rPr>
+          <w:rFonts w:cstheme="minorHAnsi"/>
+        </w:rPr>
+        <w:t xml:space="preserve"> </w:t>
+      </w:r>
+      <w:proofErr w:type="spellStart"/>
+      <w:r>
+        <w:rPr>
+          <w:rFonts w:cstheme="minorHAnsi"/>
+        </w:rPr>
+        <w:t>facilitó</w:t>
+      </w:r>
+      <w:proofErr w:type="spellEnd"/>
+      <w:r>
+        <w:rPr>
+          <w:rFonts w:cstheme="minorHAnsi"/>
+        </w:rPr>
+        <w:t xml:space="preserve"> la </w:t>
+      </w:r>
+      <w:proofErr w:type="spellStart"/>
+      <w:r>
+        <w:rPr>
+          <w:rFonts w:cstheme="minorHAnsi"/>
+        </w:rPr>
+        <w:t>reutilización</w:t>
+      </w:r>
+      <w:proofErr w:type="spellEnd"/>
+      <w:r>
+        <w:rPr>
+          <w:rFonts w:cstheme="minorHAnsi"/>
+        </w:rPr>
+        <w:t xml:space="preserve"> de </w:t>
+      </w:r>
+      <w:proofErr w:type="spellStart"/>
+      <w:r>
+        <w:rPr>
+          <w:rFonts w:cstheme="minorHAnsi"/>
+        </w:rPr>
+        <w:t>código</w:t>
+      </w:r>
+      <w:proofErr w:type="spellEnd"/>
+      <w:r>
+        <w:rPr>
+          <w:rFonts w:cstheme="minorHAnsi"/>
+        </w:rPr>
+        <w:t xml:space="preserve"> y la </w:t>
+      </w:r>
+      <w:proofErr w:type="spellStart"/>
+      <w:r>
+        <w:rPr>
+          <w:rFonts w:cstheme="minorHAnsi"/>
+        </w:rPr>
+        <w:t>extensibilidad</w:t>
+      </w:r>
+      <w:proofErr w:type="spellEnd"/>
+      <w:r>
+        <w:rPr>
+          <w:rFonts w:cstheme="minorHAnsi"/>
+        </w:rPr>
+        <w:t xml:space="preserve"> del </w:t>
+      </w:r>
+      <w:proofErr w:type="spellStart"/>
+      <w:r>
+        <w:rPr>
+          <w:rFonts w:cstheme="minorHAnsi"/>
+        </w:rPr>
+        <w:t>sistema</w:t>
+      </w:r>
+      <w:proofErr w:type="spellEnd"/>
+      <w:r>
+        <w:rPr>
+          <w:rFonts w:cstheme="minorHAnsi"/>
+        </w:rPr>
+        <w:t>.</w:t>
+      </w:r>
+    </w:p>
+    <w:p>
+      <w:pPr>
+        <w:rPr>
+          <w:rFonts w:cstheme="minorHAnsi"/>
+        </w:rPr>
+      </w:pPr>
+      <w:proofErr w:type="spellStart"/>
+      <w:r>
+        <w:rPr>
+          <w:rFonts w:cstheme="minorHAnsi"/>
+        </w:rPr>
+        <w:t>Asimismo</w:t>
+      </w:r>
+      <w:proofErr w:type="spellEnd"/>
+      <w:r>
+        <w:rPr>
+          <w:rFonts w:cstheme="minorHAnsi"/>
+        </w:rPr>
+        <w:t xml:space="preserve">, </w:t>
+      </w:r>
+      <w:proofErr w:type="spellStart"/>
+      <w:r>
+        <w:rPr>
+          <w:rFonts w:cstheme="minorHAnsi"/>
+        </w:rPr>
+        <w:t>el</w:t>
+      </w:r>
+      <w:proofErr w:type="spellEnd"/>
+      <w:r>
+        <w:rPr>
+          <w:rFonts w:cstheme="minorHAnsi"/>
+        </w:rPr>
+        <w:t xml:space="preserve"> </w:t>
+      </w:r>
+      <w:proofErr w:type="spellStart"/>
+      <w:r>
+        <w:rPr>
+          <w:rFonts w:cstheme="minorHAnsi"/>
+        </w:rPr>
+        <w:t>manejo</w:t>
+      </w:r>
+      <w:proofErr w:type="spellEnd"/>
+      <w:r>
+        <w:rPr>
+          <w:rFonts w:cstheme="minorHAnsi"/>
+        </w:rPr>
+        <w:t xml:space="preserve"> de </w:t>
+      </w:r>
+      <w:proofErr w:type="spellStart"/>
+      <w:r>
+        <w:rPr>
+          <w:rFonts w:cstheme="minorHAnsi"/>
+        </w:rPr>
+        <w:t>excepciones</w:t>
+      </w:r>
+      <w:proofErr w:type="spellEnd"/>
+      <w:r>
+        <w:rPr>
+          <w:rFonts w:cstheme="minorHAnsi"/>
+        </w:rPr>
+        <w:t xml:space="preserve"> </w:t>
+      </w:r>
+      <w:proofErr w:type="spellStart"/>
+      <w:r>
+        <w:rPr>
+          <w:rFonts w:cstheme="minorHAnsi"/>
+        </w:rPr>
+        <w:t>resultó</w:t>
+      </w:r>
+      <w:proofErr w:type="spellEnd"/>
+      <w:r>
+        <w:rPr>
+          <w:rFonts w:cstheme="minorHAnsi"/>
+        </w:rPr>
+        <w:t xml:space="preserve"> fundamental para </w:t>
+      </w:r>
+      <w:proofErr w:type="spellStart"/>
+      <w:r>
+        <w:rPr>
+          <w:rFonts w:cstheme="minorHAnsi"/>
+        </w:rPr>
+        <w:t>garantizar</w:t>
+      </w:r>
+      <w:proofErr w:type="spellEnd"/>
+      <w:r>
+        <w:rPr>
+          <w:rFonts w:cstheme="minorHAnsi"/>
+        </w:rPr>
+        <w:t xml:space="preserve"> la </w:t>
+      </w:r>
+      <w:proofErr w:type="spellStart"/>
+      <w:r>
+        <w:rPr>
+          <w:rFonts w:cstheme="minorHAnsi"/>
+        </w:rPr>
+        <w:t>estabilidad</w:t>
+      </w:r>
+      <w:proofErr w:type="spellEnd"/>
+      <w:r>
+        <w:rPr>
+          <w:rFonts w:cstheme="minorHAnsi"/>
+        </w:rPr>
+        <w:t xml:space="preserve"> de la </w:t>
+      </w:r>
+      <w:proofErr w:type="spellStart"/>
+      <w:r>
+        <w:rPr>
+          <w:rFonts w:cstheme="minorHAnsi"/>
+        </w:rPr>
+        <w:t>aplicación</w:t>
+      </w:r>
+      <w:proofErr w:type="spellEnd"/>
+      <w:r>
+        <w:rPr>
+          <w:rFonts w:cstheme="minorHAnsi"/>
+        </w:rPr>
+        <w:t xml:space="preserve">, </w:t>
+      </w:r>
+      <w:proofErr w:type="spellStart"/>
+      <w:r>
+        <w:rPr>
+          <w:rFonts w:cstheme="minorHAnsi"/>
+        </w:rPr>
+        <w:t>permitiendo</w:t>
+      </w:r>
+      <w:proofErr w:type="spellEnd"/>
+      <w:r>
+        <w:rPr>
+          <w:rFonts w:cstheme="minorHAnsi"/>
+        </w:rPr>
+        <w:t xml:space="preserve"> </w:t>
+      </w:r>
+      <w:proofErr w:type="spellStart"/>
+      <w:r>
+        <w:rPr>
+          <w:rFonts w:cstheme="minorHAnsi"/>
+        </w:rPr>
+        <w:t>controlar</w:t>
+      </w:r>
+      <w:proofErr w:type="spellEnd"/>
+      <w:r>
+        <w:rPr>
+          <w:rFonts w:cstheme="minorHAnsi"/>
+        </w:rPr>
+        <w:t xml:space="preserve"> </w:t>
+      </w:r>
+      <w:proofErr w:type="spellStart"/>
+      <w:r>
+        <w:rPr>
+          <w:rFonts w:cstheme="minorHAnsi"/>
+        </w:rPr>
+        <w:t>errores</w:t>
+      </w:r>
+      <w:proofErr w:type="spellEnd"/>
+      <w:r>
+        <w:rPr>
+          <w:rFonts w:cstheme="minorHAnsi"/>
+        </w:rPr>
+        <w:t xml:space="preserve"> sin </w:t>
+      </w:r>
+      <w:proofErr w:type="spellStart"/>
+      <w:r>
+        <w:rPr>
+          <w:rFonts w:cstheme="minorHAnsi"/>
+        </w:rPr>
+        <w:t>interrumpir</w:t>
+      </w:r>
+      <w:proofErr w:type="spellEnd"/>
+      <w:r>
+        <w:rPr>
+          <w:rFonts w:cstheme="minorHAnsi"/>
+        </w:rPr>
+        <w:t xml:space="preserve"> </w:t>
+      </w:r>
+      <w:proofErr w:type="spellStart"/>
+      <w:r>
+        <w:rPr>
+          <w:rFonts w:cstheme="minorHAnsi"/>
+        </w:rPr>
+        <w:t>su</w:t>
+      </w:r>
+      <w:proofErr w:type="spellEnd"/>
+      <w:r>
+        <w:rPr>
+          <w:rFonts w:cstheme="minorHAnsi"/>
+        </w:rPr>
+        <w:t xml:space="preserve"> </w:t>
+      </w:r>
+      <w:proofErr w:type="spellStart"/>
+      <w:r>
+        <w:rPr>
+          <w:rFonts w:cstheme="minorHAnsi"/>
+        </w:rPr>
+        <w:t>ejecución</w:t>
+      </w:r>
+      <w:proofErr w:type="spellEnd"/>
+      <w:r>
+        <w:rPr>
+          <w:rFonts w:cstheme="minorHAnsi"/>
+        </w:rPr>
+        <w:t xml:space="preserve">. El </w:t>
+      </w:r>
+      <w:proofErr w:type="spellStart"/>
+      <w:r>
+        <w:rPr>
+          <w:rFonts w:cstheme="minorHAnsi"/>
+        </w:rPr>
+        <w:t>uso</w:t>
+      </w:r>
+      <w:proofErr w:type="spellEnd"/>
+      <w:r>
+        <w:rPr>
+          <w:rFonts w:cstheme="minorHAnsi"/>
+        </w:rPr>
+        <w:t xml:space="preserve"> de </w:t>
+      </w:r>
+      <w:proofErr w:type="spellStart"/>
+      <w:r>
+        <w:rPr>
+          <w:rFonts w:cstheme="minorHAnsi"/>
+        </w:rPr>
+        <w:t>excepciones</w:t>
+      </w:r>
+      <w:proofErr w:type="spellEnd"/>
+      <w:r>
+        <w:rPr>
+          <w:rFonts w:cstheme="minorHAnsi"/>
+        </w:rPr>
+        <w:t xml:space="preserve"> </w:t>
+      </w:r>
+      <w:proofErr w:type="spellStart"/>
+      <w:r>
+        <w:rPr>
+          <w:rFonts w:cstheme="minorHAnsi"/>
+        </w:rPr>
+        <w:t>personalizadas</w:t>
+      </w:r>
+      <w:proofErr w:type="spellEnd"/>
+      <w:r>
+        <w:rPr>
+          <w:rFonts w:cstheme="minorHAnsi"/>
+        </w:rPr>
+        <w:t xml:space="preserve"> y </w:t>
+      </w:r>
+      <w:proofErr w:type="spellStart"/>
+      <w:r>
+        <w:rPr>
+          <w:rFonts w:cstheme="minorHAnsi"/>
+        </w:rPr>
+        <w:t>registros</w:t>
+      </w:r>
+      <w:proofErr w:type="spellEnd"/>
+      <w:r>
+        <w:rPr>
+          <w:rFonts w:cstheme="minorHAnsi"/>
+        </w:rPr>
+        <w:t xml:space="preserve"> </w:t>
+      </w:r>
+      <w:proofErr w:type="spellStart"/>
+      <w:r>
+        <w:rPr>
+          <w:rFonts w:cstheme="minorHAnsi"/>
+        </w:rPr>
+        <w:t>en</w:t>
+      </w:r>
+      <w:proofErr w:type="spellEnd"/>
+      <w:r>
+        <w:rPr>
+          <w:rFonts w:cstheme="minorHAnsi"/>
+        </w:rPr>
+        <w:t xml:space="preserve"> </w:t>
+      </w:r>
+      <w:proofErr w:type="spellStart"/>
+      <w:r>
+        <w:rPr>
+          <w:rFonts w:cstheme="minorHAnsi"/>
+        </w:rPr>
+        <w:t>archivos</w:t>
+      </w:r>
+      <w:proofErr w:type="spellEnd"/>
+      <w:r>
+        <w:rPr>
+          <w:rFonts w:cstheme="minorHAnsi"/>
+        </w:rPr>
+        <w:t xml:space="preserve"> de log </w:t>
+      </w:r>
+      <w:proofErr w:type="spellStart"/>
+      <w:r>
+        <w:rPr>
+          <w:rFonts w:cstheme="minorHAnsi"/>
+        </w:rPr>
+        <w:t>contribuyó</w:t>
+      </w:r>
+      <w:proofErr w:type="spellEnd"/>
+      <w:r>
+        <w:rPr>
+          <w:rFonts w:cstheme="minorHAnsi"/>
+        </w:rPr>
+        <w:t xml:space="preserve"> a </w:t>
+      </w:r>
+      <w:proofErr w:type="spellStart"/>
+      <w:r>
+        <w:rPr>
+          <w:rFonts w:cstheme="minorHAnsi"/>
+        </w:rPr>
+        <w:t>una</w:t>
+      </w:r>
+      <w:proofErr w:type="spellEnd"/>
+      <w:r>
+        <w:rPr>
+          <w:rFonts w:cstheme="minorHAnsi"/>
+        </w:rPr>
+        <w:t xml:space="preserve"> </w:t>
+      </w:r>
+      <w:proofErr w:type="spellStart"/>
+      <w:r>
+        <w:rPr>
+          <w:rFonts w:cstheme="minorHAnsi"/>
+        </w:rPr>
+        <w:t>mejor</w:t>
+      </w:r>
+      <w:proofErr w:type="spellEnd"/>
+      <w:r>
+        <w:rPr>
+          <w:rFonts w:cstheme="minorHAnsi"/>
+        </w:rPr>
+        <w:t xml:space="preserve"> </w:t>
+      </w:r>
+      <w:proofErr w:type="spellStart"/>
+      <w:r>
+        <w:rPr>
+          <w:rFonts w:cstheme="minorHAnsi"/>
+        </w:rPr>
+        <w:t>gestión</w:t>
+      </w:r>
+      <w:proofErr w:type="spellEnd"/>
+      <w:r>
+        <w:rPr>
+          <w:rFonts w:cstheme="minorHAnsi"/>
+        </w:rPr>
+        <w:t xml:space="preserve"> de </w:t>
+      </w:r>
+      <w:proofErr w:type="spellStart"/>
+      <w:r>
+        <w:rPr>
+          <w:rFonts w:cstheme="minorHAnsi"/>
+        </w:rPr>
+        <w:t>fallos</w:t>
+      </w:r>
+      <w:proofErr w:type="spellEnd"/>
+      <w:r>
+        <w:rPr>
+          <w:rFonts w:cstheme="minorHAnsi"/>
+        </w:rPr>
+        <w:t>.</w:t>
+      </w:r>
+    </w:p>
+    <w:p>
+      <w:pPr>
+        <w:rPr>
+          <w:rFonts w:cstheme="minorHAnsi"/>
+        </w:rPr>
+      </w:pPr>
+      <w:proofErr w:type="spellStart"/>
+      <w:r>
+        <w:rPr>
+          <w:rFonts w:cstheme="minorHAnsi"/>
+        </w:rPr>
+        <w:t>Finalmente</w:t>
+      </w:r>
+      <w:proofErr w:type="spellEnd"/>
+      <w:r>
+        <w:rPr>
+          <w:rFonts w:cstheme="minorHAnsi"/>
+        </w:rPr>
+        <w:t xml:space="preserve">, se </w:t>
+      </w:r>
+      <w:proofErr w:type="spellStart"/>
+      <w:r>
+        <w:rPr>
+          <w:rFonts w:cstheme="minorHAnsi"/>
+        </w:rPr>
+        <w:t>evidencia</w:t>
+      </w:r>
+      <w:proofErr w:type="spellEnd"/>
+      <w:r>
+        <w:rPr>
+          <w:rFonts w:cstheme="minorHAnsi"/>
+        </w:rPr>
+        <w:t xml:space="preserve"> que es </w:t>
+      </w:r>
+      <w:proofErr w:type="spellStart"/>
+      <w:r>
+        <w:rPr>
+          <w:rFonts w:cstheme="minorHAnsi"/>
+        </w:rPr>
+        <w:t>posible</w:t>
+      </w:r>
+      <w:proofErr w:type="spellEnd"/>
+      <w:r>
+        <w:rPr>
+          <w:rFonts w:cstheme="minorHAnsi"/>
+        </w:rPr>
+        <w:t xml:space="preserve"> </w:t>
+      </w:r>
+      <w:proofErr w:type="spellStart"/>
+      <w:r>
+        <w:rPr>
+          <w:rFonts w:cstheme="minorHAnsi"/>
+        </w:rPr>
+        <w:t>construir</w:t>
+      </w:r>
+      <w:proofErr w:type="spellEnd"/>
+      <w:r>
+        <w:rPr>
+          <w:rFonts w:cstheme="minorHAnsi"/>
+        </w:rPr>
+        <w:t xml:space="preserve"> </w:t>
+      </w:r>
+      <w:proofErr w:type="spellStart"/>
+      <w:r>
+        <w:rPr>
+          <w:rFonts w:cstheme="minorHAnsi"/>
+        </w:rPr>
+        <w:t>soluciones</w:t>
+      </w:r>
+      <w:proofErr w:type="spellEnd"/>
+      <w:r>
+        <w:rPr>
+          <w:rFonts w:cstheme="minorHAnsi"/>
+        </w:rPr>
+        <w:t xml:space="preserve"> </w:t>
+      </w:r>
+      <w:proofErr w:type="spellStart"/>
+      <w:r>
+        <w:rPr>
+          <w:rFonts w:cstheme="minorHAnsi"/>
+        </w:rPr>
+        <w:t>robustas</w:t>
+      </w:r>
+      <w:proofErr w:type="spellEnd"/>
+      <w:r>
+        <w:rPr>
+          <w:rFonts w:cstheme="minorHAnsi"/>
+        </w:rPr>
+        <w:t xml:space="preserve"> sin </w:t>
+      </w:r>
+      <w:proofErr w:type="spellStart"/>
+      <w:r>
+        <w:rPr>
+          <w:rFonts w:cstheme="minorHAnsi"/>
+        </w:rPr>
+        <w:t>el</w:t>
+      </w:r>
+      <w:proofErr w:type="spellEnd"/>
+      <w:r>
+        <w:rPr>
+          <w:rFonts w:cstheme="minorHAnsi"/>
+        </w:rPr>
+        <w:t xml:space="preserve"> </w:t>
+      </w:r>
+      <w:proofErr w:type="spellStart"/>
+      <w:r>
+        <w:rPr>
+          <w:rFonts w:cstheme="minorHAnsi"/>
+        </w:rPr>
+        <w:t>uso</w:t>
+      </w:r>
+      <w:proofErr w:type="spellEnd"/>
+      <w:r>
+        <w:rPr>
+          <w:rFonts w:cstheme="minorHAnsi"/>
+        </w:rPr>
+        <w:t xml:space="preserve"> de bases de </w:t>
+      </w:r>
+      <w:proofErr w:type="spellStart"/>
+      <w:r>
+        <w:rPr>
+          <w:rFonts w:cstheme="minorHAnsi"/>
+        </w:rPr>
+        <w:t>datos</w:t>
+      </w:r>
+      <w:proofErr w:type="spellEnd"/>
+      <w:r>
+        <w:rPr>
+          <w:rFonts w:cstheme="minorHAnsi"/>
+        </w:rPr>
+        <w:t xml:space="preserve">, </w:t>
+      </w:r>
+      <w:proofErr w:type="spellStart"/>
+      <w:r>
+        <w:rPr>
+          <w:rFonts w:cstheme="minorHAnsi"/>
+        </w:rPr>
+        <w:t>utilizando</w:t>
+      </w:r>
+      <w:proofErr w:type="spellEnd"/>
+      <w:r>
+        <w:rPr>
+          <w:rFonts w:cstheme="minorHAnsi"/>
+        </w:rPr>
+        <w:t xml:space="preserve"> </w:t>
+      </w:r>
+      <w:proofErr w:type="spellStart"/>
+      <w:r>
+        <w:rPr>
+          <w:rFonts w:cstheme="minorHAnsi"/>
+        </w:rPr>
+        <w:t>estructuras</w:t>
+      </w:r>
+      <w:proofErr w:type="spellEnd"/>
+      <w:r>
+        <w:rPr>
+          <w:rFonts w:cstheme="minorHAnsi"/>
+        </w:rPr>
+        <w:t xml:space="preserve"> </w:t>
+      </w:r>
+      <w:proofErr w:type="spellStart"/>
+      <w:r>
+        <w:rPr>
+          <w:rFonts w:cstheme="minorHAnsi"/>
+        </w:rPr>
+        <w:t>en</w:t>
+      </w:r>
+      <w:proofErr w:type="spellEnd"/>
+      <w:r>
+        <w:rPr>
+          <w:rFonts w:cstheme="minorHAnsi"/>
+        </w:rPr>
+        <w:t xml:space="preserve"> </w:t>
+      </w:r>
+      <w:proofErr w:type="spellStart"/>
+      <w:r>
+        <w:rPr>
+          <w:rFonts w:cstheme="minorHAnsi"/>
+        </w:rPr>
+        <w:t>memoria</w:t>
+      </w:r>
+      <w:proofErr w:type="spellEnd"/>
+      <w:r>
+        <w:rPr>
+          <w:rFonts w:cstheme="minorHAnsi"/>
+        </w:rPr>
+        <w:t xml:space="preserve"> y </w:t>
+      </w:r>
+      <w:proofErr w:type="spellStart"/>
+      <w:r>
+        <w:rPr>
+          <w:rFonts w:cstheme="minorHAnsi"/>
+        </w:rPr>
+        <w:t>archivos</w:t>
+      </w:r>
+      <w:proofErr w:type="spellEnd"/>
+      <w:r>
+        <w:rPr>
+          <w:rFonts w:cstheme="minorHAnsi"/>
+        </w:rPr>
+        <w:t xml:space="preserve">, </w:t>
+      </w:r>
+      <w:proofErr w:type="spellStart"/>
+      <w:r>
+        <w:rPr>
+          <w:rFonts w:cstheme="minorHAnsi"/>
+        </w:rPr>
+        <w:t>cumpliendo</w:t>
+      </w:r>
+      <w:proofErr w:type="spellEnd"/>
+      <w:r>
+        <w:rPr>
+          <w:rFonts w:cstheme="minorHAnsi"/>
+        </w:rPr>
+        <w:t xml:space="preserve"> con </w:t>
+      </w:r>
+      <w:proofErr w:type="spellStart"/>
+      <w:r>
+        <w:rPr>
+          <w:rFonts w:cstheme="minorHAnsi"/>
+        </w:rPr>
+        <w:t>los</w:t>
+      </w:r>
+      <w:proofErr w:type="spellEnd"/>
+      <w:r>
+        <w:rPr>
+          <w:rFonts w:cstheme="minorHAnsi"/>
+        </w:rPr>
+        <w:t xml:space="preserve"> </w:t>
+      </w:r>
+      <w:proofErr w:type="spellStart"/>
+      <w:r>
+        <w:rPr>
+          <w:rFonts w:cstheme="minorHAnsi"/>
+        </w:rPr>
+        <w:t>requerimientos</w:t>
+      </w:r>
+      <w:proofErr w:type="spellEnd"/>
+      <w:r>
+        <w:rPr>
+          <w:rFonts w:cstheme="minorHAnsi"/>
+        </w:rPr>
+        <w:t xml:space="preserve"> </w:t>
+      </w:r>
+      <w:proofErr w:type="spellStart"/>
+      <w:r>
+        <w:rPr>
+          <w:rFonts w:cstheme="minorHAnsi"/>
+        </w:rPr>
+        <w:t>establecidos</w:t>
+      </w:r>
+      <w:proofErr w:type="spellEnd"/>
+      <w:r>
+        <w:rPr>
+          <w:rFonts w:cstheme="minorHAnsi"/>
+        </w:rPr>
+        <w:t xml:space="preserve"> </w:t>
+      </w:r>
+      <w:proofErr w:type="spellStart"/>
+      <w:r>
+        <w:rPr>
+          <w:rFonts w:cstheme="minorHAnsi"/>
+        </w:rPr>
+        <w:t>en</w:t>
+      </w:r>
+      <w:proofErr w:type="spellEnd"/>
+      <w:r>
+        <w:rPr>
+          <w:rFonts w:cstheme="minorHAnsi"/>
+        </w:rPr>
+        <w:t xml:space="preserve"> la </w:t>
+      </w:r>
+      <w:proofErr w:type="spellStart"/>
+      <w:r>
+        <w:rPr>
+          <w:rFonts w:cstheme="minorHAnsi"/>
+        </w:rPr>
+        <w:t>actividad</w:t>
+      </w:r>
+      <w:proofErr w:type="spellEnd"/>
+      <w:r>
+        <w:rPr>
+          <w:rFonts w:cstheme="minorHAnsi"/>
+        </w:rPr>
+        <w:t>.</w:t>
       </w:r>
     </w:p>
     <w:p>
@@ -1696,7 +5000,7 @@
         </w:rPr>
         <w:t> </w:t>
       </w:r>
-      <w:hyperlink r:id="rId9" w:tooltip="El tutorial de Python." w:history="1">
+      <w:hyperlink r:id="rId10" w:tooltip="El tutorial de Python." w:history="1">
         <w:r>
           <w:rPr>
             <w:rStyle w:val="Hipervnculo"/>
@@ -1755,7 +5059,7 @@
       <w:r>
         <w:t>Cuevas Álvarez, A. (2016). </w:t>
       </w:r>
-      <w:hyperlink r:id="rId10" w:history="1">
+      <w:hyperlink r:id="rId11" w:history="1">
         <w:r>
           <w:rPr>
             <w:rStyle w:val="Hipervnculo"/>
@@ -1767,7 +5071,15 @@
         </w:r>
       </w:hyperlink>
       <w:r>
-        <w:t>: ( ed.). RA-MA Editorial. https://elibro- net.bibliotecavirtual.unad.edu.co/es/ereader/unad/106404?page=373</w:t>
+        <w:t xml:space="preserve">: </w:t>
+      </w:r>
+      <w:proofErr w:type="gramStart"/>
+      <w:r>
+        <w:t>( ed.</w:t>
+      </w:r>
+      <w:proofErr w:type="gramEnd"/>
+      <w:r>
+        <w:t>). RA-MA Editorial. https://elibro- net.bibliotecavirtual.unad.edu.co/es/ereader/unad/106404?page=373</w:t>
       </w:r>
       <w:r>
         <w:rPr>
@@ -1803,7 +5115,7 @@
         </w:rPr>
         <w:t>Pravin Mishra. (2024). </w:t>
       </w:r>
-      <w:hyperlink r:id="rId11" w:history="1">
+      <w:hyperlink r:id="rId12" w:history="1">
         <w:r>
           <w:rPr>
             <w:rStyle w:val="Hipervnculo"/>
@@ -1827,9 +5139,17 @@
         <w:pStyle w:val="apa7"/>
       </w:pPr>
       <w:r>
-        <w:t>Silva, F. D. (2025). . </w:t>
-      </w:r>
-      <w:hyperlink r:id="rId12" w:tooltip="Basics of using GitHub." w:history="1">
+        <w:t>Silva, F. D. (2025)</w:t>
+      </w:r>
+      <w:proofErr w:type="gramStart"/>
+      <w:r>
+        <w:t>. .</w:t>
+      </w:r>
+      <w:proofErr w:type="gramEnd"/>
+      <w:r>
+        <w:t> </w:t>
+      </w:r>
+      <w:hyperlink r:id="rId13" w:tooltip="Basics of using GitHub." w:history="1">
         <w:r>
           <w:rPr>
             <w:rStyle w:val="Hipervnculo"/>
@@ -1841,7 +5161,31 @@
       </w:hyperlink>
       <w:r>
         <w:br/>
-        <w:t>[Objeto_virtual_de_información_OVI]. Repositorio Institucional UNAD.</w:t>
+        <w:t>[</w:t>
+      </w:r>
+      <w:proofErr w:type="spellStart"/>
+      <w:r>
+        <w:t>Objeto_virtual_de_información_OVI</w:t>
+      </w:r>
+      <w:proofErr w:type="spellEnd"/>
+      <w:r>
+        <w:t xml:space="preserve">]. </w:t>
+      </w:r>
+      <w:proofErr w:type="spellStart"/>
+      <w:r>
+        <w:t>Repositorio</w:t>
+      </w:r>
+      <w:proofErr w:type="spellEnd"/>
+      <w:r>
+        <w:t xml:space="preserve"> </w:t>
+      </w:r>
+      <w:proofErr w:type="spellStart"/>
+      <w:r>
+        <w:t>Institucional</w:t>
+      </w:r>
+      <w:proofErr w:type="spellEnd"/>
+      <w:r>
+        <w:t xml:space="preserve"> UNAD.</w:t>
       </w:r>
       <w:r>
         <w:br/>
@@ -1858,9 +5202,17 @@
         </w:rPr>
       </w:pPr>
       <w:r>
-        <w:t>Zambrano, J. P. (2025). . </w:t>
-      </w:r>
-      <w:hyperlink r:id="rId13" w:tooltip="Introducción al uso de GitHub." w:history="1">
+        <w:t>Zambrano, J. P. (2025)</w:t>
+      </w:r>
+      <w:proofErr w:type="gramStart"/>
+      <w:r>
+        <w:t>. .</w:t>
+      </w:r>
+      <w:proofErr w:type="gramEnd"/>
+      <w:r>
+        <w:t> </w:t>
+      </w:r>
+      <w:hyperlink r:id="rId14" w:tooltip="Introducción al uso de GitHub." w:history="1">
         <w:r>
           <w:rPr>
             <w:rStyle w:val="Hipervnculo"/>
@@ -1872,7 +5224,31 @@
       </w:hyperlink>
       <w:r>
         <w:br/>
-        <w:t>[Objeto_virtual_de_información_OVI]. Repositorio Institucional UNAD</w:t>
+        <w:t>[</w:t>
+      </w:r>
+      <w:proofErr w:type="spellStart"/>
+      <w:r>
+        <w:t>Objeto_virtual_de_información_OVI</w:t>
+      </w:r>
+      <w:proofErr w:type="spellEnd"/>
+      <w:r>
+        <w:t xml:space="preserve">]. </w:t>
+      </w:r>
+      <w:proofErr w:type="spellStart"/>
+      <w:r>
+        <w:t>Repositorio</w:t>
+      </w:r>
+      <w:proofErr w:type="spellEnd"/>
+      <w:r>
+        <w:t xml:space="preserve"> </w:t>
+      </w:r>
+      <w:proofErr w:type="spellStart"/>
+      <w:r>
+        <w:t>Institucional</w:t>
+      </w:r>
+      <w:proofErr w:type="spellEnd"/>
+      <w:r>
+        <w:t xml:space="preserve"> UNAD</w:t>
       </w:r>
       <w:r>
         <w:t>.</w:t>
@@ -1886,10 +5262,39 @@
       <w:pPr>
         <w:pStyle w:val="apa7"/>
       </w:pPr>
-      <w:r>
-        <w:t xml:space="preserve">Normas APA actualizadas 7ª edición (2020). Portada. </w:t>
-      </w:r>
-      <w:hyperlink r:id="rId14">
+      <w:proofErr w:type="spellStart"/>
+      <w:r>
+        <w:t>Normas</w:t>
+      </w:r>
+      <w:proofErr w:type="spellEnd"/>
+      <w:r>
+        <w:t xml:space="preserve"> APA </w:t>
+      </w:r>
+      <w:proofErr w:type="spellStart"/>
+      <w:r>
+        <w:t>actualizadas</w:t>
+      </w:r>
+      <w:proofErr w:type="spellEnd"/>
+      <w:r>
+        <w:t xml:space="preserve"> 7ª </w:t>
+      </w:r>
+      <w:proofErr w:type="spellStart"/>
+      <w:r>
+        <w:t>edición</w:t>
+      </w:r>
+      <w:proofErr w:type="spellEnd"/>
+      <w:r>
+        <w:t xml:space="preserve"> (2020). </w:t>
+      </w:r>
+      <w:proofErr w:type="spellStart"/>
+      <w:r>
+        <w:t>Portada</w:t>
+      </w:r>
+      <w:proofErr w:type="spellEnd"/>
+      <w:r>
+        <w:t xml:space="preserve">. </w:t>
+      </w:r>
+      <w:hyperlink r:id="rId15">
         <w:r>
           <w:rPr>
             <w:rStyle w:val="Hipervnculo"/>
@@ -1905,10 +5310,55 @@
       <w:pPr>
         <w:pStyle w:val="apa7"/>
       </w:pPr>
-      <w:r>
-        <w:t xml:space="preserve">Instructivo para la usabilidad de Normas internacionales de citación APA 7° Edición. Biblioteca.unad.edu.co. (2020). </w:t>
-      </w:r>
-      <w:hyperlink r:id="rId15">
+      <w:proofErr w:type="spellStart"/>
+      <w:r>
+        <w:t>Instructivo</w:t>
+      </w:r>
+      <w:proofErr w:type="spellEnd"/>
+      <w:r>
+        <w:t xml:space="preserve"> para la </w:t>
+      </w:r>
+      <w:proofErr w:type="spellStart"/>
+      <w:r>
+        <w:t>usabilidad</w:t>
+      </w:r>
+      <w:proofErr w:type="spellEnd"/>
+      <w:r>
+        <w:t xml:space="preserve"> de </w:t>
+      </w:r>
+      <w:proofErr w:type="spellStart"/>
+      <w:r>
+        <w:t>Normas</w:t>
+      </w:r>
+      <w:proofErr w:type="spellEnd"/>
+      <w:r>
+        <w:t xml:space="preserve"> </w:t>
+      </w:r>
+      <w:proofErr w:type="spellStart"/>
+      <w:r>
+        <w:t>internacionales</w:t>
+      </w:r>
+      <w:proofErr w:type="spellEnd"/>
+      <w:r>
+        <w:t xml:space="preserve"> de </w:t>
+      </w:r>
+      <w:proofErr w:type="spellStart"/>
+      <w:r>
+        <w:t>citación</w:t>
+      </w:r>
+      <w:proofErr w:type="spellEnd"/>
+      <w:r>
+        <w:t xml:space="preserve"> APA 7° </w:t>
+      </w:r>
+      <w:proofErr w:type="spellStart"/>
+      <w:r>
+        <w:t>Edición</w:t>
+      </w:r>
+      <w:proofErr w:type="spellEnd"/>
+      <w:r>
+        <w:t xml:space="preserve">. Biblioteca.unad.edu.co. (2020). </w:t>
+      </w:r>
+      <w:hyperlink r:id="rId16">
         <w:r>
           <w:rPr>
             <w:rStyle w:val="Hipervnculo"/>
@@ -1918,8 +5368,8 @@
       </w:hyperlink>
     </w:p>
     <w:sectPr>
-      <w:headerReference w:type="default" r:id="rId16"/>
-      <w:footerReference w:type="default" r:id="rId17"/>
+      <w:headerReference w:type="default" r:id="rId17"/>
+      <w:footerReference w:type="default" r:id="rId18"/>
       <w:type w:val="continuous"/>
       <w:pgSz w:w="11910" w:h="16840"/>
       <w:pgMar w:top="1440" w:right="1440" w:bottom="1440" w:left="1440" w:header="720" w:footer="720" w:gutter="0"/>

</xml_diff>